<commit_message>
FIX TEXTBOX UNTUK TTD
</commit_message>
<xml_diff>
--- a/backend/templates/Berkas Luar Kota - SPD.docx
+++ b/backend/templates/Berkas Luar Kota - SPD.docx
@@ -3105,12 +3105,12 @@
             <wp:anchor distT="0" distB="0" distL="0" distR="0" simplePos="0" relativeHeight="251659264" behindDoc="1" locked="0" layoutInCell="1" allowOverlap="1" wp14:anchorId="3BED9D09" wp14:editId="25AE331E">
               <wp:simplePos x="0" y="0"/>
               <wp:positionH relativeFrom="page">
-                <wp:posOffset>5161534</wp:posOffset>
+                <wp:posOffset>4740000</wp:posOffset>
               </wp:positionH>
               <wp:positionV relativeFrom="page">
-                <wp:posOffset>10848847</wp:posOffset>
+                <wp:posOffset>11198847</wp:posOffset>
               </wp:positionV>
-              <wp:extent cx="1556385" cy="347345"/>
+              <wp:extent cx="2400000" cy="500000"/>
               <wp:effectExtent l="0" t="0" r="0" b="0"/>
               <wp:wrapNone/>
               <wp:docPr id="1" name="Textbox 1"/>
@@ -3126,7 +3126,7 @@
                     <wps:spPr>
                       <a:xfrm>
                         <a:off x="0" y="0"/>
-                        <a:ext cx="1556385" cy="347345"/>
+                        <a:ext cx="2400000" cy="500000"/>
                       </a:xfrm>
                       <a:prstGeom prst="rect">
                         <a:avLst/>
@@ -3195,7 +3195,7 @@
               <v:stroke joinstyle="miter"/>
               <v:path gradientshapeok="t" o:connecttype="rect"/>
             </v:shapetype>
-            <v:shape id="Textbox 1" o:spid="_x0000_s1026" type="#_x0000_t202" style="position:absolute;margin-left:406.4pt;margin-top:854.25pt;width:122.55pt;height:27.35pt;z-index:-251657216;visibility:visible;mso-wrap-style:square;mso-wrap-distance-left:0;mso-wrap-distance-top:0;mso-wrap-distance-right:0;mso-wrap-distance-bottom:0;mso-position-horizontal:absolute;mso-position-horizontal-relative:page;mso-position-vertical:absolute;mso-position-vertical-relative:page;v-text-anchor:top" o:gfxdata="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" filled="f" stroked="f">
+            <v:shape id="Textbox 1" o:spid="_x0000_s1026" type="#_x0000_t202" style="position:absolute;margin-left:373pt;margin-top:882pt;width:189pt;height:39pt;z-index:-251657216;visibility:visible;mso-wrap-style:square;mso-wrap-distance-left:0;mso-wrap-distance-top:0;mso-wrap-distance-right:0;mso-wrap-distance-bottom:0;mso-position-horizontal:absolute;mso-position-horizontal-relative:page;mso-position-vertical:absolute;mso-position-vertical-relative:page;v-text-anchor:top" o:gfxdata="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" filled="f" stroked="f">
               <v:textbox inset="0,0,0,0">
                 <w:txbxContent>
                   <w:p>

</xml_diff>

<commit_message>
fix: enforce non-breaking gaps for empty surat tugas number and date in documents
</commit_message>
<xml_diff>
--- a/backend/templates/Berkas Luar Kota - SPD.docx
+++ b/backend/templates/Berkas Luar Kota - SPD.docx
@@ -1,10 +1,10 @@
 
 <file path=word/document.xml><?xml version="1.0" encoding="utf-8"?>
-<w:document xmlns:wpc="http://schemas.microsoft.com/office/word/2010/wordprocessingCanvas" xmlns:cx="http://schemas.microsoft.com/office/drawing/2014/chartex" xmlns:cx1="http://schemas.microsoft.com/office/drawing/2015/9/8/chartex" xmlns:cx2="http://schemas.microsoft.com/office/drawing/2015/10/21/chartex" xmlns:cx3="http://schemas.microsoft.com/office/drawing/2016/5/9/chartex" xmlns:cx4="http://schemas.microsoft.com/office/drawing/2016/5/10/chartex" xmlns:cx5="http://schemas.microsoft.com/office/drawing/2016/5/11/chartex" xmlns:cx6="http://schemas.microsoft.com/office/drawing/2016/5/12/chartex" xmlns:cx7="http://schemas.microsoft.com/office/drawing/2016/5/13/chartex" xmlns:cx8="http://schemas.microsoft.com/office/drawing/2016/5/14/chartex" xmlns:mc="http://schemas.openxmlformats.org/markup-compatibility/2006" xmlns:aink="http://schemas.microsoft.com/office/drawing/2016/ink" xmlns:am3d="http://schemas.microsoft.com/office/drawing/2017/model3d" xmlns:o="urn:schemas-microsoft-com:office:office" xmlns:r="http://schemas.openxmlformats.org/officeDocument/2006/relationships" xmlns:m="http://schemas.openxmlformats.org/officeDocument/2006/math" xmlns:v="urn:schemas-microsoft-com:vml" xmlns:wp14="http://schemas.microsoft.com/office/word/2010/wordprocessingDrawing" xmlns:wp="http://schemas.openxmlformats.org/drawingml/2006/wordprocessingDrawing" xmlns:w10="urn:schemas-microsoft-com:office:word" xmlns:w="http://schemas.openxmlformats.org/wordprocessingml/2006/main" xmlns:w14="http://schemas.microsoft.com/office/word/2010/wordml" xmlns:w15="http://schemas.microsoft.com/office/word/2012/wordml" xmlns:w16cex="http://schemas.microsoft.com/office/word/2018/wordml/cex" xmlns:w16cid="http://schemas.microsoft.com/office/word/2016/wordml/cid" xmlns:w16="http://schemas.microsoft.com/office/word/2018/wordml" xmlns:w16sdtdh="http://schemas.microsoft.com/office/word/2020/wordml/sdtdatahash" xmlns:w16se="http://schemas.microsoft.com/office/word/2015/wordml/symex" xmlns:wpg="http://schemas.microsoft.com/office/word/2010/wordprocessingGroup" xmlns:wpi="http://schemas.microsoft.com/office/word/2010/wordprocessingInk" xmlns:wne="http://schemas.microsoft.com/office/word/2006/wordml" xmlns:wps="http://schemas.microsoft.com/office/word/2010/wordprocessingShape" mc:Ignorable="w14 w15 w16se w16cid w16 w16cex w16sdtdh wp14">
+<w:document xmlns:wpc="http://schemas.microsoft.com/office/word/2010/wordprocessingCanvas" xmlns:cx="http://schemas.microsoft.com/office/drawing/2014/chartex" xmlns:cx1="http://schemas.microsoft.com/office/drawing/2015/9/8/chartex" xmlns:cx2="http://schemas.microsoft.com/office/drawing/2015/10/21/chartex" xmlns:cx3="http://schemas.microsoft.com/office/drawing/2016/5/9/chartex" xmlns:cx4="http://schemas.microsoft.com/office/drawing/2016/5/10/chartex" xmlns:cx5="http://schemas.microsoft.com/office/drawing/2016/5/11/chartex" xmlns:cx6="http://schemas.microsoft.com/office/drawing/2016/5/12/chartex" xmlns:cx7="http://schemas.microsoft.com/office/drawing/2016/5/13/chartex" xmlns:cx8="http://schemas.microsoft.com/office/drawing/2016/5/14/chartex" xmlns:mc="http://schemas.openxmlformats.org/markup-compatibility/2006" xmlns:aink="http://schemas.microsoft.com/office/drawing/2016/ink" xmlns:am3d="http://schemas.microsoft.com/office/drawing/2017/model3d" xmlns:o="urn:schemas-microsoft-com:office:office" xmlns:oel="http://schemas.microsoft.com/office/2019/extlst" xmlns:r="http://schemas.openxmlformats.org/officeDocument/2006/relationships" xmlns:m="http://schemas.openxmlformats.org/officeDocument/2006/math" xmlns:v="urn:schemas-microsoft-com:vml" xmlns:wp14="http://schemas.microsoft.com/office/word/2010/wordprocessingDrawing" xmlns:wp="http://schemas.openxmlformats.org/drawingml/2006/wordprocessingDrawing" xmlns:w10="urn:schemas-microsoft-com:office:word" xmlns:w="http://schemas.openxmlformats.org/wordprocessingml/2006/main" xmlns:w14="http://schemas.microsoft.com/office/word/2010/wordml" xmlns:w15="http://schemas.microsoft.com/office/word/2012/wordml" xmlns:w16cex="http://schemas.microsoft.com/office/word/2018/wordml/cex" xmlns:w16cid="http://schemas.microsoft.com/office/word/2016/wordml/cid" xmlns:w16="http://schemas.microsoft.com/office/word/2018/wordml" xmlns:w16sdtdh="http://schemas.microsoft.com/office/word/2020/wordml/sdtdatahash" xmlns:w16se="http://schemas.microsoft.com/office/word/2015/wordml/symex" xmlns:wpg="http://schemas.microsoft.com/office/word/2010/wordprocessingGroup" xmlns:wpi="http://schemas.microsoft.com/office/word/2010/wordprocessingInk" xmlns:wne="http://schemas.microsoft.com/office/word/2006/wordml" xmlns:wps="http://schemas.microsoft.com/office/word/2010/wordprocessingShape" mc:Ignorable="w14 w15 w16se w16cid w16 w16cex w16sdtdh wp14">
   <w:body>
     <w:p>
       <w:pPr>
-        <w:pStyle w:val="TeksIsi"/>
+        <w:pStyle w:val="BodyText"/>
         <w:spacing w:before="80"/>
         <w:ind w:left="418"/>
       </w:pPr>
@@ -36,7 +36,7 @@
     </w:p>
     <w:tbl>
       <w:tblPr>
-        <w:tblStyle w:val="KisiTabel"/>
+        <w:tblStyle w:val="TableGrid"/>
         <w:tblW w:w="2887" w:type="pct"/>
         <w:tblInd w:w="4503" w:type="dxa"/>
         <w:tblBorders>
@@ -2958,7 +2958,7 @@
     </w:p>
     <w:p>
       <w:pPr>
-        <w:pStyle w:val="TeksIsi"/>
+        <w:pStyle w:val="BodyText"/>
         <w:spacing w:before="201" w:line="338" w:lineRule="auto"/>
         <w:ind w:left="7207" w:right="325" w:firstLine="187"/>
       </w:pPr>
@@ -2971,15 +2971,15 @@
         <mc:AlternateContent>
           <mc:Choice Requires="wps">
             <w:drawing>
-              <wp:anchor distT="0" distB="0" distL="0" distR="0" simplePos="0" relativeHeight="251658240" behindDoc="1" locked="0" layoutInCell="1" allowOverlap="1" wp14:anchorId="73F3E6E1" wp14:editId="149BFF8A">
+              <wp:anchor distT="0" distB="0" distL="0" distR="0" simplePos="0" relativeHeight="251658240" behindDoc="1" locked="0" layoutInCell="1" allowOverlap="1" wp14:anchorId="73F3E6E1" wp14:editId="56019485">
                 <wp:simplePos x="0" y="0"/>
                 <wp:positionH relativeFrom="page">
-                  <wp:posOffset>4648200</wp:posOffset>
+                  <wp:posOffset>4724400</wp:posOffset>
                 </wp:positionH>
                 <wp:positionV relativeFrom="page">
-                  <wp:posOffset>11134090</wp:posOffset>
+                  <wp:posOffset>11134725</wp:posOffset>
                 </wp:positionV>
-                <wp:extent cx="2400000" cy="500000"/>
+                <wp:extent cx="2323465" cy="500000"/>
                 <wp:effectExtent l="0" t="0" r="0" b="0"/>
                 <wp:wrapNone/>
                 <wp:docPr id="1" name="Textbox 1"/>
@@ -2995,7 +2995,7 @@
                       <wps:spPr>
                         <a:xfrm>
                           <a:off x="0" y="0"/>
-                          <a:ext cx="2400000" cy="500000"/>
+                          <a:ext cx="2323465" cy="500000"/>
                         </a:xfrm>
                         <a:prstGeom prst="rect">
                           <a:avLst/>
@@ -3048,6 +3048,9 @@
                     </wps:wsp>
                   </a:graphicData>
                 </a:graphic>
+                <wp14:sizeRelH relativeFrom="margin">
+                  <wp14:pctWidth>0</wp14:pctWidth>
+                </wp14:sizeRelH>
               </wp:anchor>
             </w:drawing>
           </mc:Choice>
@@ -3057,7 +3060,7 @@
                 <v:stroke joinstyle="miter"/>
                 <v:path gradientshapeok="t" o:connecttype="rect"/>
               </v:shapetype>
-              <v:shape id="Textbox 1" o:spid="_x0000_s1026" type="#_x0000_t202" style="position:absolute;left:0;text-align:left;margin-left:366pt;margin-top:876.7pt;width:189pt;height:39.35pt;z-index:-251658240;visibility:visible;mso-wrap-style:square;mso-wrap-distance-left:0;mso-wrap-distance-top:0;mso-wrap-distance-right:0;mso-wrap-distance-bottom:0;mso-position-horizontal:absolute;mso-position-horizontal-relative:page;mso-position-vertical:absolute;mso-position-vertical-relative:page;v-text-anchor:top" o:gfxdata="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" filled="f" stroked="f">
+              <v:shape id="Textbox 1" o:spid="_x0000_s1026" type="#_x0000_t202" style="position:absolute;left:0;text-align:left;margin-left:372pt;margin-top:876.75pt;width:182.95pt;height:39.35pt;z-index:-251658240;visibility:visible;mso-wrap-style:square;mso-width-percent:0;mso-wrap-distance-left:0;mso-wrap-distance-top:0;mso-wrap-distance-right:0;mso-wrap-distance-bottom:0;mso-position-horizontal:absolute;mso-position-horizontal-relative:page;mso-position-vertical:absolute;mso-position-vertical-relative:page;mso-width-percent:0;mso-width-relative:margin;v-text-anchor:top" o:gfxdata="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" filled="f" stroked="f">
                 <v:textbox inset="0,0,0,0">
                   <w:txbxContent>
                     <w:p>
@@ -3121,7 +3124,7 @@
 </file>
 
 <file path=word/endnotes.xml><?xml version="1.0" encoding="utf-8"?>
-<w:endnotes xmlns:wpc="http://schemas.microsoft.com/office/word/2010/wordprocessingCanvas" xmlns:cx="http://schemas.microsoft.com/office/drawing/2014/chartex" xmlns:cx1="http://schemas.microsoft.com/office/drawing/2015/9/8/chartex" xmlns:cx2="http://schemas.microsoft.com/office/drawing/2015/10/21/chartex" xmlns:cx3="http://schemas.microsoft.com/office/drawing/2016/5/9/chartex" xmlns:cx4="http://schemas.microsoft.com/office/drawing/2016/5/10/chartex" xmlns:cx5="http://schemas.microsoft.com/office/drawing/2016/5/11/chartex" xmlns:cx6="http://schemas.microsoft.com/office/drawing/2016/5/12/chartex" xmlns:cx7="http://schemas.microsoft.com/office/drawing/2016/5/13/chartex" xmlns:cx8="http://schemas.microsoft.com/office/drawing/2016/5/14/chartex" xmlns:mc="http://schemas.openxmlformats.org/markup-compatibility/2006" xmlns:aink="http://schemas.microsoft.com/office/drawing/2016/ink" xmlns:am3d="http://schemas.microsoft.com/office/drawing/2017/model3d" xmlns:o="urn:schemas-microsoft-com:office:office" xmlns:r="http://schemas.openxmlformats.org/officeDocument/2006/relationships" xmlns:m="http://schemas.openxmlformats.org/officeDocument/2006/math" xmlns:v="urn:schemas-microsoft-com:vml" xmlns:wp14="http://schemas.microsoft.com/office/word/2010/wordprocessingDrawing" xmlns:wp="http://schemas.openxmlformats.org/drawingml/2006/wordprocessingDrawing" xmlns:w10="urn:schemas-microsoft-com:office:word" xmlns:w="http://schemas.openxmlformats.org/wordprocessingml/2006/main" xmlns:w14="http://schemas.microsoft.com/office/word/2010/wordml" xmlns:w15="http://schemas.microsoft.com/office/word/2012/wordml" xmlns:w16cex="http://schemas.microsoft.com/office/word/2018/wordml/cex" xmlns:w16cid="http://schemas.microsoft.com/office/word/2016/wordml/cid" xmlns:w16="http://schemas.microsoft.com/office/word/2018/wordml" xmlns:w16sdtdh="http://schemas.microsoft.com/office/word/2020/wordml/sdtdatahash" xmlns:w16se="http://schemas.microsoft.com/office/word/2015/wordml/symex" xmlns:wpg="http://schemas.microsoft.com/office/word/2010/wordprocessingGroup" xmlns:wpi="http://schemas.microsoft.com/office/word/2010/wordprocessingInk" xmlns:wne="http://schemas.microsoft.com/office/word/2006/wordml" xmlns:wps="http://schemas.microsoft.com/office/word/2010/wordprocessingShape" mc:Ignorable="w14 w15 w16se w16cid w16 w16cex w16sdtdh wp14">
+<w:endnotes xmlns:wpc="http://schemas.microsoft.com/office/word/2010/wordprocessingCanvas" xmlns:cx="http://schemas.microsoft.com/office/drawing/2014/chartex" xmlns:cx1="http://schemas.microsoft.com/office/drawing/2015/9/8/chartex" xmlns:cx2="http://schemas.microsoft.com/office/drawing/2015/10/21/chartex" xmlns:cx3="http://schemas.microsoft.com/office/drawing/2016/5/9/chartex" xmlns:cx4="http://schemas.microsoft.com/office/drawing/2016/5/10/chartex" xmlns:cx5="http://schemas.microsoft.com/office/drawing/2016/5/11/chartex" xmlns:cx6="http://schemas.microsoft.com/office/drawing/2016/5/12/chartex" xmlns:cx7="http://schemas.microsoft.com/office/drawing/2016/5/13/chartex" xmlns:cx8="http://schemas.microsoft.com/office/drawing/2016/5/14/chartex" xmlns:mc="http://schemas.openxmlformats.org/markup-compatibility/2006" xmlns:aink="http://schemas.microsoft.com/office/drawing/2016/ink" xmlns:am3d="http://schemas.microsoft.com/office/drawing/2017/model3d" xmlns:o="urn:schemas-microsoft-com:office:office" xmlns:oel="http://schemas.microsoft.com/office/2019/extlst" xmlns:r="http://schemas.openxmlformats.org/officeDocument/2006/relationships" xmlns:m="http://schemas.openxmlformats.org/officeDocument/2006/math" xmlns:v="urn:schemas-microsoft-com:vml" xmlns:wp14="http://schemas.microsoft.com/office/word/2010/wordprocessingDrawing" xmlns:wp="http://schemas.openxmlformats.org/drawingml/2006/wordprocessingDrawing" xmlns:w10="urn:schemas-microsoft-com:office:word" xmlns:w="http://schemas.openxmlformats.org/wordprocessingml/2006/main" xmlns:w14="http://schemas.microsoft.com/office/word/2010/wordml" xmlns:w15="http://schemas.microsoft.com/office/word/2012/wordml" xmlns:w16cex="http://schemas.microsoft.com/office/word/2018/wordml/cex" xmlns:w16cid="http://schemas.microsoft.com/office/word/2016/wordml/cid" xmlns:w16="http://schemas.microsoft.com/office/word/2018/wordml" xmlns:w16sdtdh="http://schemas.microsoft.com/office/word/2020/wordml/sdtdatahash" xmlns:w16se="http://schemas.microsoft.com/office/word/2015/wordml/symex" xmlns:wpg="http://schemas.microsoft.com/office/word/2010/wordprocessingGroup" xmlns:wpi="http://schemas.microsoft.com/office/word/2010/wordprocessingInk" xmlns:wne="http://schemas.microsoft.com/office/word/2006/wordml" xmlns:wps="http://schemas.microsoft.com/office/word/2010/wordprocessingShape" mc:Ignorable="w14 w15 w16se w16cid w16 w16cex w16sdtdh wp14">
   <w:endnote w:type="separator" w:id="-1">
     <w:p>
       <w:r>
@@ -3140,10 +3143,10 @@
 </file>
 
 <file path=word/footer1.xml><?xml version="1.0" encoding="utf-8"?>
-<w:ftr xmlns:wpc="http://schemas.microsoft.com/office/word/2010/wordprocessingCanvas" xmlns:cx="http://schemas.microsoft.com/office/drawing/2014/chartex" xmlns:cx1="http://schemas.microsoft.com/office/drawing/2015/9/8/chartex" xmlns:cx2="http://schemas.microsoft.com/office/drawing/2015/10/21/chartex" xmlns:cx3="http://schemas.microsoft.com/office/drawing/2016/5/9/chartex" xmlns:cx4="http://schemas.microsoft.com/office/drawing/2016/5/10/chartex" xmlns:cx5="http://schemas.microsoft.com/office/drawing/2016/5/11/chartex" xmlns:cx6="http://schemas.microsoft.com/office/drawing/2016/5/12/chartex" xmlns:cx7="http://schemas.microsoft.com/office/drawing/2016/5/13/chartex" xmlns:cx8="http://schemas.microsoft.com/office/drawing/2016/5/14/chartex" xmlns:mc="http://schemas.openxmlformats.org/markup-compatibility/2006" xmlns:aink="http://schemas.microsoft.com/office/drawing/2016/ink" xmlns:am3d="http://schemas.microsoft.com/office/drawing/2017/model3d" xmlns:o="urn:schemas-microsoft-com:office:office" xmlns:r="http://schemas.openxmlformats.org/officeDocument/2006/relationships" xmlns:m="http://schemas.openxmlformats.org/officeDocument/2006/math" xmlns:v="urn:schemas-microsoft-com:vml" xmlns:wp14="http://schemas.microsoft.com/office/word/2010/wordprocessingDrawing" xmlns:wp="http://schemas.openxmlformats.org/drawingml/2006/wordprocessingDrawing" xmlns:w10="urn:schemas-microsoft-com:office:word" xmlns:w="http://schemas.openxmlformats.org/wordprocessingml/2006/main" xmlns:w14="http://schemas.microsoft.com/office/word/2010/wordml" xmlns:w15="http://schemas.microsoft.com/office/word/2012/wordml" xmlns:w16cex="http://schemas.microsoft.com/office/word/2018/wordml/cex" xmlns:w16cid="http://schemas.microsoft.com/office/word/2016/wordml/cid" xmlns:w16="http://schemas.microsoft.com/office/word/2018/wordml" xmlns:w16sdtdh="http://schemas.microsoft.com/office/word/2020/wordml/sdtdatahash" xmlns:w16se="http://schemas.microsoft.com/office/word/2015/wordml/symex" xmlns:wpg="http://schemas.microsoft.com/office/word/2010/wordprocessingGroup" xmlns:wpi="http://schemas.microsoft.com/office/word/2010/wordprocessingInk" xmlns:wne="http://schemas.microsoft.com/office/word/2006/wordml" xmlns:wps="http://schemas.microsoft.com/office/word/2010/wordprocessingShape" mc:Ignorable="w14 w15 w16se w16cid w16 w16cex w16sdtdh wp14">
+<w:ftr xmlns:wpc="http://schemas.microsoft.com/office/word/2010/wordprocessingCanvas" xmlns:cx="http://schemas.microsoft.com/office/drawing/2014/chartex" xmlns:cx1="http://schemas.microsoft.com/office/drawing/2015/9/8/chartex" xmlns:cx2="http://schemas.microsoft.com/office/drawing/2015/10/21/chartex" xmlns:cx3="http://schemas.microsoft.com/office/drawing/2016/5/9/chartex" xmlns:cx4="http://schemas.microsoft.com/office/drawing/2016/5/10/chartex" xmlns:cx5="http://schemas.microsoft.com/office/drawing/2016/5/11/chartex" xmlns:cx6="http://schemas.microsoft.com/office/drawing/2016/5/12/chartex" xmlns:cx7="http://schemas.microsoft.com/office/drawing/2016/5/13/chartex" xmlns:cx8="http://schemas.microsoft.com/office/drawing/2016/5/14/chartex" xmlns:mc="http://schemas.openxmlformats.org/markup-compatibility/2006" xmlns:aink="http://schemas.microsoft.com/office/drawing/2016/ink" xmlns:am3d="http://schemas.microsoft.com/office/drawing/2017/model3d" xmlns:o="urn:schemas-microsoft-com:office:office" xmlns:oel="http://schemas.microsoft.com/office/2019/extlst" xmlns:r="http://schemas.openxmlformats.org/officeDocument/2006/relationships" xmlns:m="http://schemas.openxmlformats.org/officeDocument/2006/math" xmlns:v="urn:schemas-microsoft-com:vml" xmlns:wp14="http://schemas.microsoft.com/office/word/2010/wordprocessingDrawing" xmlns:wp="http://schemas.openxmlformats.org/drawingml/2006/wordprocessingDrawing" xmlns:w10="urn:schemas-microsoft-com:office:word" xmlns:w="http://schemas.openxmlformats.org/wordprocessingml/2006/main" xmlns:w14="http://schemas.microsoft.com/office/word/2010/wordml" xmlns:w15="http://schemas.microsoft.com/office/word/2012/wordml" xmlns:w16cex="http://schemas.microsoft.com/office/word/2018/wordml/cex" xmlns:w16cid="http://schemas.microsoft.com/office/word/2016/wordml/cid" xmlns:w16="http://schemas.microsoft.com/office/word/2018/wordml" xmlns:w16sdtdh="http://schemas.microsoft.com/office/word/2020/wordml/sdtdatahash" xmlns:w16se="http://schemas.microsoft.com/office/word/2015/wordml/symex" xmlns:wpg="http://schemas.microsoft.com/office/word/2010/wordprocessingGroup" xmlns:wpi="http://schemas.microsoft.com/office/word/2010/wordprocessingInk" xmlns:wne="http://schemas.microsoft.com/office/word/2006/wordml" xmlns:wps="http://schemas.microsoft.com/office/word/2010/wordprocessingShape" mc:Ignorable="w14 w15 w16se w16cid w16 w16cex w16sdtdh wp14">
   <w:p>
     <w:pPr>
-      <w:pStyle w:val="TeksIsi"/>
+      <w:pStyle w:val="BodyText"/>
       <w:spacing w:line="14" w:lineRule="auto"/>
       <w:rPr>
         <w:b w:val="0"/>
@@ -3155,7 +3158,7 @@
 </file>
 
 <file path=word/footnotes.xml><?xml version="1.0" encoding="utf-8"?>
-<w:footnotes xmlns:wpc="http://schemas.microsoft.com/office/word/2010/wordprocessingCanvas" xmlns:cx="http://schemas.microsoft.com/office/drawing/2014/chartex" xmlns:cx1="http://schemas.microsoft.com/office/drawing/2015/9/8/chartex" xmlns:cx2="http://schemas.microsoft.com/office/drawing/2015/10/21/chartex" xmlns:cx3="http://schemas.microsoft.com/office/drawing/2016/5/9/chartex" xmlns:cx4="http://schemas.microsoft.com/office/drawing/2016/5/10/chartex" xmlns:cx5="http://schemas.microsoft.com/office/drawing/2016/5/11/chartex" xmlns:cx6="http://schemas.microsoft.com/office/drawing/2016/5/12/chartex" xmlns:cx7="http://schemas.microsoft.com/office/drawing/2016/5/13/chartex" xmlns:cx8="http://schemas.microsoft.com/office/drawing/2016/5/14/chartex" xmlns:mc="http://schemas.openxmlformats.org/markup-compatibility/2006" xmlns:aink="http://schemas.microsoft.com/office/drawing/2016/ink" xmlns:am3d="http://schemas.microsoft.com/office/drawing/2017/model3d" xmlns:o="urn:schemas-microsoft-com:office:office" xmlns:r="http://schemas.openxmlformats.org/officeDocument/2006/relationships" xmlns:m="http://schemas.openxmlformats.org/officeDocument/2006/math" xmlns:v="urn:schemas-microsoft-com:vml" xmlns:wp14="http://schemas.microsoft.com/office/word/2010/wordprocessingDrawing" xmlns:wp="http://schemas.openxmlformats.org/drawingml/2006/wordprocessingDrawing" xmlns:w10="urn:schemas-microsoft-com:office:word" xmlns:w="http://schemas.openxmlformats.org/wordprocessingml/2006/main" xmlns:w14="http://schemas.microsoft.com/office/word/2010/wordml" xmlns:w15="http://schemas.microsoft.com/office/word/2012/wordml" xmlns:w16cex="http://schemas.microsoft.com/office/word/2018/wordml/cex" xmlns:w16cid="http://schemas.microsoft.com/office/word/2016/wordml/cid" xmlns:w16="http://schemas.microsoft.com/office/word/2018/wordml" xmlns:w16sdtdh="http://schemas.microsoft.com/office/word/2020/wordml/sdtdatahash" xmlns:w16se="http://schemas.microsoft.com/office/word/2015/wordml/symex" xmlns:wpg="http://schemas.microsoft.com/office/word/2010/wordprocessingGroup" xmlns:wpi="http://schemas.microsoft.com/office/word/2010/wordprocessingInk" xmlns:wne="http://schemas.microsoft.com/office/word/2006/wordml" xmlns:wps="http://schemas.microsoft.com/office/word/2010/wordprocessingShape" mc:Ignorable="w14 w15 w16se w16cid w16 w16cex w16sdtdh wp14">
+<w:footnotes xmlns:wpc="http://schemas.microsoft.com/office/word/2010/wordprocessingCanvas" xmlns:cx="http://schemas.microsoft.com/office/drawing/2014/chartex" xmlns:cx1="http://schemas.microsoft.com/office/drawing/2015/9/8/chartex" xmlns:cx2="http://schemas.microsoft.com/office/drawing/2015/10/21/chartex" xmlns:cx3="http://schemas.microsoft.com/office/drawing/2016/5/9/chartex" xmlns:cx4="http://schemas.microsoft.com/office/drawing/2016/5/10/chartex" xmlns:cx5="http://schemas.microsoft.com/office/drawing/2016/5/11/chartex" xmlns:cx6="http://schemas.microsoft.com/office/drawing/2016/5/12/chartex" xmlns:cx7="http://schemas.microsoft.com/office/drawing/2016/5/13/chartex" xmlns:cx8="http://schemas.microsoft.com/office/drawing/2016/5/14/chartex" xmlns:mc="http://schemas.openxmlformats.org/markup-compatibility/2006" xmlns:aink="http://schemas.microsoft.com/office/drawing/2016/ink" xmlns:am3d="http://schemas.microsoft.com/office/drawing/2017/model3d" xmlns:o="urn:schemas-microsoft-com:office:office" xmlns:oel="http://schemas.microsoft.com/office/2019/extlst" xmlns:r="http://schemas.openxmlformats.org/officeDocument/2006/relationships" xmlns:m="http://schemas.openxmlformats.org/officeDocument/2006/math" xmlns:v="urn:schemas-microsoft-com:vml" xmlns:wp14="http://schemas.microsoft.com/office/word/2010/wordprocessingDrawing" xmlns:wp="http://schemas.openxmlformats.org/drawingml/2006/wordprocessingDrawing" xmlns:w10="urn:schemas-microsoft-com:office:word" xmlns:w="http://schemas.openxmlformats.org/wordprocessingml/2006/main" xmlns:w14="http://schemas.microsoft.com/office/word/2010/wordml" xmlns:w15="http://schemas.microsoft.com/office/word/2012/wordml" xmlns:w16cex="http://schemas.microsoft.com/office/word/2018/wordml/cex" xmlns:w16cid="http://schemas.microsoft.com/office/word/2016/wordml/cid" xmlns:w16="http://schemas.microsoft.com/office/word/2018/wordml" xmlns:w16sdtdh="http://schemas.microsoft.com/office/word/2020/wordml/sdtdatahash" xmlns:w16se="http://schemas.microsoft.com/office/word/2015/wordml/symex" xmlns:wpg="http://schemas.microsoft.com/office/word/2010/wordprocessingGroup" xmlns:wpi="http://schemas.microsoft.com/office/word/2010/wordprocessingInk" xmlns:wne="http://schemas.microsoft.com/office/word/2006/wordml" xmlns:wps="http://schemas.microsoft.com/office/word/2010/wordprocessingShape" mc:Ignorable="w14 w15 w16se w16cid w16 w16cex w16sdtdh wp14">
   <w:footnote w:type="separator" w:id="-1">
     <w:p>
       <w:r>
@@ -3174,7 +3177,7 @@
 </file>
 
 <file path=word/numbering.xml><?xml version="1.0" encoding="utf-8"?>
-<w:numbering xmlns:wpc="http://schemas.microsoft.com/office/word/2010/wordprocessingCanvas" xmlns:cx="http://schemas.microsoft.com/office/drawing/2014/chartex" xmlns:cx1="http://schemas.microsoft.com/office/drawing/2015/9/8/chartex" xmlns:cx2="http://schemas.microsoft.com/office/drawing/2015/10/21/chartex" xmlns:cx3="http://schemas.microsoft.com/office/drawing/2016/5/9/chartex" xmlns:cx4="http://schemas.microsoft.com/office/drawing/2016/5/10/chartex" xmlns:cx5="http://schemas.microsoft.com/office/drawing/2016/5/11/chartex" xmlns:cx6="http://schemas.microsoft.com/office/drawing/2016/5/12/chartex" xmlns:cx7="http://schemas.microsoft.com/office/drawing/2016/5/13/chartex" xmlns:cx8="http://schemas.microsoft.com/office/drawing/2016/5/14/chartex" xmlns:mc="http://schemas.openxmlformats.org/markup-compatibility/2006" xmlns:aink="http://schemas.microsoft.com/office/drawing/2016/ink" xmlns:am3d="http://schemas.microsoft.com/office/drawing/2017/model3d" xmlns:o="urn:schemas-microsoft-com:office:office" xmlns:r="http://schemas.openxmlformats.org/officeDocument/2006/relationships" xmlns:m="http://schemas.openxmlformats.org/officeDocument/2006/math" xmlns:v="urn:schemas-microsoft-com:vml" xmlns:wp14="http://schemas.microsoft.com/office/word/2010/wordprocessingDrawing" xmlns:wp="http://schemas.openxmlformats.org/drawingml/2006/wordprocessingDrawing" xmlns:w10="urn:schemas-microsoft-com:office:word" xmlns:w="http://schemas.openxmlformats.org/wordprocessingml/2006/main" xmlns:w14="http://schemas.microsoft.com/office/word/2010/wordml" xmlns:w15="http://schemas.microsoft.com/office/word/2012/wordml" xmlns:w16cex="http://schemas.microsoft.com/office/word/2018/wordml/cex" xmlns:w16cid="http://schemas.microsoft.com/office/word/2016/wordml/cid" xmlns:w16="http://schemas.microsoft.com/office/word/2018/wordml" xmlns:w16sdtdh="http://schemas.microsoft.com/office/word/2020/wordml/sdtdatahash" xmlns:w16se="http://schemas.microsoft.com/office/word/2015/wordml/symex" xmlns:wpg="http://schemas.microsoft.com/office/word/2010/wordprocessingGroup" xmlns:wpi="http://schemas.microsoft.com/office/word/2010/wordprocessingInk" xmlns:wne="http://schemas.microsoft.com/office/word/2006/wordml" xmlns:wps="http://schemas.microsoft.com/office/word/2010/wordprocessingShape" mc:Ignorable="w14 w15 w16se w16cid w16 w16cex w16sdtdh wp14">
+<w:numbering xmlns:wpc="http://schemas.microsoft.com/office/word/2010/wordprocessingCanvas" xmlns:cx="http://schemas.microsoft.com/office/drawing/2014/chartex" xmlns:cx1="http://schemas.microsoft.com/office/drawing/2015/9/8/chartex" xmlns:cx2="http://schemas.microsoft.com/office/drawing/2015/10/21/chartex" xmlns:cx3="http://schemas.microsoft.com/office/drawing/2016/5/9/chartex" xmlns:cx4="http://schemas.microsoft.com/office/drawing/2016/5/10/chartex" xmlns:cx5="http://schemas.microsoft.com/office/drawing/2016/5/11/chartex" xmlns:cx6="http://schemas.microsoft.com/office/drawing/2016/5/12/chartex" xmlns:cx7="http://schemas.microsoft.com/office/drawing/2016/5/13/chartex" xmlns:cx8="http://schemas.microsoft.com/office/drawing/2016/5/14/chartex" xmlns:mc="http://schemas.openxmlformats.org/markup-compatibility/2006" xmlns:aink="http://schemas.microsoft.com/office/drawing/2016/ink" xmlns:am3d="http://schemas.microsoft.com/office/drawing/2017/model3d" xmlns:o="urn:schemas-microsoft-com:office:office" xmlns:oel="http://schemas.microsoft.com/office/2019/extlst" xmlns:r="http://schemas.openxmlformats.org/officeDocument/2006/relationships" xmlns:m="http://schemas.openxmlformats.org/officeDocument/2006/math" xmlns:v="urn:schemas-microsoft-com:vml" xmlns:wp14="http://schemas.microsoft.com/office/word/2010/wordprocessingDrawing" xmlns:wp="http://schemas.openxmlformats.org/drawingml/2006/wordprocessingDrawing" xmlns:w10="urn:schemas-microsoft-com:office:word" xmlns:w="http://schemas.openxmlformats.org/wordprocessingml/2006/main" xmlns:w14="http://schemas.microsoft.com/office/word/2010/wordml" xmlns:w15="http://schemas.microsoft.com/office/word/2012/wordml" xmlns:w16cex="http://schemas.microsoft.com/office/word/2018/wordml/cex" xmlns:w16cid="http://schemas.microsoft.com/office/word/2016/wordml/cid" xmlns:w16="http://schemas.microsoft.com/office/word/2018/wordml" xmlns:w16sdtdh="http://schemas.microsoft.com/office/word/2020/wordml/sdtdatahash" xmlns:w16se="http://schemas.microsoft.com/office/word/2015/wordml/symex" xmlns:wpg="http://schemas.microsoft.com/office/word/2010/wordprocessingGroup" xmlns:wpi="http://schemas.microsoft.com/office/word/2010/wordprocessingInk" xmlns:wne="http://schemas.microsoft.com/office/word/2006/wordml" xmlns:wps="http://schemas.microsoft.com/office/word/2010/wordprocessingShape" mc:Ignorable="w14 w15 w16se w16cid w16 w16cex w16sdtdh wp14">
   <w:abstractNum w:abstractNumId="0" w15:restartNumberingAfterBreak="0">
     <w:nsid w:val="19EF28AB"/>
     <w:multiLevelType w:val="hybridMultilevel"/>
@@ -3996,25 +3999,25 @@
       </w:rPr>
     </w:lvl>
   </w:abstractNum>
-  <w:num w:numId="1">
+  <w:num w:numId="1" w16cid:durableId="375550444">
     <w:abstractNumId w:val="3"/>
   </w:num>
-  <w:num w:numId="2">
+  <w:num w:numId="2" w16cid:durableId="317274616">
     <w:abstractNumId w:val="2"/>
   </w:num>
-  <w:num w:numId="3">
+  <w:num w:numId="3" w16cid:durableId="1498106561">
     <w:abstractNumId w:val="4"/>
   </w:num>
-  <w:num w:numId="4">
+  <w:num w:numId="4" w16cid:durableId="527838777">
     <w:abstractNumId w:val="5"/>
   </w:num>
-  <w:num w:numId="5">
+  <w:num w:numId="5" w16cid:durableId="1316179562">
     <w:abstractNumId w:val="1"/>
   </w:num>
-  <w:num w:numId="6">
+  <w:num w:numId="6" w16cid:durableId="1778987367">
     <w:abstractNumId w:val="6"/>
   </w:num>
-  <w:num w:numId="7">
+  <w:num w:numId="7" w16cid:durableId="1006591471">
     <w:abstractNumId w:val="0"/>
   </w:num>
 </w:numbering>
@@ -4425,13 +4428,13 @@
       <w:lang w:val="ms"/>
     </w:rPr>
   </w:style>
-  <w:style w:type="character" w:default="1" w:styleId="FontParagrafDefault">
+  <w:style w:type="character" w:default="1" w:styleId="DefaultParagraphFont">
     <w:name w:val="Default Paragraph Font"/>
     <w:uiPriority w:val="1"/>
     <w:semiHidden/>
     <w:unhideWhenUsed/>
   </w:style>
-  <w:style w:type="table" w:default="1" w:styleId="TabelNormal">
+  <w:style w:type="table" w:default="1" w:styleId="TableNormal">
     <w:name w:val="Normal Table"/>
     <w:uiPriority w:val="99"/>
     <w:semiHidden/>
@@ -4446,13 +4449,13 @@
       </w:tblCellMar>
     </w:tblPr>
   </w:style>
-  <w:style w:type="numbering" w:default="1" w:styleId="TidakAdaDaftar">
+  <w:style w:type="numbering" w:default="1" w:styleId="NoList">
     <w:name w:val="No List"/>
     <w:uiPriority w:val="99"/>
     <w:semiHidden/>
     <w:unhideWhenUsed/>
   </w:style>
-  <w:style w:type="paragraph" w:styleId="TeksIsi">
+  <w:style w:type="paragraph" w:styleId="BodyText">
     <w:name w:val="Body Text"/>
     <w:basedOn w:val="Normal"/>
     <w:uiPriority w:val="1"/>
@@ -4465,7 +4468,7 @@
       <w:szCs w:val="18"/>
     </w:rPr>
   </w:style>
-  <w:style w:type="paragraph" w:styleId="DaftarParagraf">
+  <w:style w:type="paragraph" w:styleId="ListParagraph">
     <w:name w:val="List Paragraph"/>
     <w:basedOn w:val="Normal"/>
     <w:uiPriority w:val="1"/>
@@ -4480,7 +4483,7 @@
   <w:style w:type="paragraph" w:styleId="Header">
     <w:name w:val="header"/>
     <w:basedOn w:val="Normal"/>
-    <w:link w:val="HeaderKAR"/>
+    <w:link w:val="HeaderChar"/>
     <w:uiPriority w:val="99"/>
     <w:unhideWhenUsed/>
     <w:rsid w:val="001643BC"/>
@@ -4491,9 +4494,9 @@
       </w:tabs>
     </w:pPr>
   </w:style>
-  <w:style w:type="character" w:customStyle="1" w:styleId="HeaderKAR">
-    <w:name w:val="Header KAR"/>
-    <w:basedOn w:val="FontParagrafDefault"/>
+  <w:style w:type="character" w:customStyle="1" w:styleId="HeaderChar">
+    <w:name w:val="Header Char"/>
+    <w:basedOn w:val="DefaultParagraphFont"/>
     <w:link w:val="Header"/>
     <w:uiPriority w:val="99"/>
     <w:rsid w:val="001643BC"/>
@@ -4505,7 +4508,7 @@
   <w:style w:type="paragraph" w:styleId="Footer">
     <w:name w:val="footer"/>
     <w:basedOn w:val="Normal"/>
-    <w:link w:val="FooterKAR"/>
+    <w:link w:val="FooterChar"/>
     <w:uiPriority w:val="99"/>
     <w:unhideWhenUsed/>
     <w:rsid w:val="001643BC"/>
@@ -4516,9 +4519,9 @@
       </w:tabs>
     </w:pPr>
   </w:style>
-  <w:style w:type="character" w:customStyle="1" w:styleId="FooterKAR">
-    <w:name w:val="Footer KAR"/>
-    <w:basedOn w:val="FontParagrafDefault"/>
+  <w:style w:type="character" w:customStyle="1" w:styleId="FooterChar">
+    <w:name w:val="Footer Char"/>
+    <w:basedOn w:val="DefaultParagraphFont"/>
     <w:link w:val="Footer"/>
     <w:uiPriority w:val="99"/>
     <w:rsid w:val="001643BC"/>
@@ -4527,9 +4530,9 @@
       <w:lang w:val="ms"/>
     </w:rPr>
   </w:style>
-  <w:style w:type="table" w:styleId="KisiTabel">
+  <w:style w:type="table" w:styleId="TableGrid">
     <w:name w:val="Table Grid"/>
-    <w:basedOn w:val="TabelNormal"/>
+    <w:basedOn w:val="TableNormal"/>
     <w:uiPriority w:val="39"/>
     <w:rsid w:val="00817182"/>
     <w:tblPr>

</xml_diff>

<commit_message>
fix: improve SPD number consistency and correct transport field mapping in Cetak Rincian
</commit_message>
<xml_diff>
--- a/backend/templates/Berkas Luar Kota - SPD.docx
+++ b/backend/templates/Berkas Luar Kota - SPD.docx
@@ -249,14 +249,14 @@
                 <w:sz w:val="18"/>
                 <w:szCs w:val="18"/>
               </w:rPr>
-              <w:t>/{{id_sp</w:t>
+              <w:t>/{{</w:t>
             </w:r>
             <w:r>
               <w:rPr>
                 <w:sz w:val="18"/>
                 <w:szCs w:val="18"/>
               </w:rPr>
-              <w:t>j</w:t>
+              <w:t>no_spd</w:t>
             </w:r>
             <w:r>
               <w:rPr>

</xml_diff>

<commit_message>
feat: implement 401 modal, E2E tests, and update SPD template
</commit_message>
<xml_diff>
--- a/backend/templates/Berkas Luar Kota - SPD.docx
+++ b/backend/templates/Berkas Luar Kota - SPD.docx
@@ -1,6 +1,6 @@
 
 <file path=word/document.xml><?xml version="1.0" encoding="utf-8"?>
-<w:document xmlns:wpc="http://schemas.microsoft.com/office/word/2010/wordprocessingCanvas" xmlns:cx="http://schemas.microsoft.com/office/drawing/2014/chartex" xmlns:cx1="http://schemas.microsoft.com/office/drawing/2015/9/8/chartex" xmlns:cx2="http://schemas.microsoft.com/office/drawing/2015/10/21/chartex" xmlns:cx3="http://schemas.microsoft.com/office/drawing/2016/5/9/chartex" xmlns:cx4="http://schemas.microsoft.com/office/drawing/2016/5/10/chartex" xmlns:cx5="http://schemas.microsoft.com/office/drawing/2016/5/11/chartex" xmlns:cx6="http://schemas.microsoft.com/office/drawing/2016/5/12/chartex" xmlns:cx7="http://schemas.microsoft.com/office/drawing/2016/5/13/chartex" xmlns:cx8="http://schemas.microsoft.com/office/drawing/2016/5/14/chartex" xmlns:mc="http://schemas.openxmlformats.org/markup-compatibility/2006" xmlns:aink="http://schemas.microsoft.com/office/drawing/2016/ink" xmlns:am3d="http://schemas.microsoft.com/office/drawing/2017/model3d" xmlns:o="urn:schemas-microsoft-com:office:office" xmlns:oel="http://schemas.microsoft.com/office/2019/extlst" xmlns:r="http://schemas.openxmlformats.org/officeDocument/2006/relationships" xmlns:m="http://schemas.openxmlformats.org/officeDocument/2006/math" xmlns:v="urn:schemas-microsoft-com:vml" xmlns:wp14="http://schemas.microsoft.com/office/word/2010/wordprocessingDrawing" xmlns:wp="http://schemas.openxmlformats.org/drawingml/2006/wordprocessingDrawing" xmlns:w10="urn:schemas-microsoft-com:office:word" xmlns:w="http://schemas.openxmlformats.org/wordprocessingml/2006/main" xmlns:w14="http://schemas.microsoft.com/office/word/2010/wordml" xmlns:w15="http://schemas.microsoft.com/office/word/2012/wordml" xmlns:w16cex="http://schemas.microsoft.com/office/word/2018/wordml/cex" xmlns:w16cid="http://schemas.microsoft.com/office/word/2016/wordml/cid" xmlns:w16="http://schemas.microsoft.com/office/word/2018/wordml" xmlns:w16sdtdh="http://schemas.microsoft.com/office/word/2020/wordml/sdtdatahash" xmlns:w16se="http://schemas.microsoft.com/office/word/2015/wordml/symex" xmlns:wpg="http://schemas.microsoft.com/office/word/2010/wordprocessingGroup" xmlns:wpi="http://schemas.microsoft.com/office/word/2010/wordprocessingInk" xmlns:wne="http://schemas.microsoft.com/office/word/2006/wordml" xmlns:wps="http://schemas.microsoft.com/office/word/2010/wordprocessingShape" mc:Ignorable="w14 w15 w16se w16cid w16 w16cex w16sdtdh wp14">
+<w:document xmlns:wpc="http://schemas.microsoft.com/office/word/2010/wordprocessingCanvas" xmlns:cx="http://schemas.microsoft.com/office/drawing/2014/chartex" xmlns:cx1="http://schemas.microsoft.com/office/drawing/2015/9/8/chartex" xmlns:cx2="http://schemas.microsoft.com/office/drawing/2015/10/21/chartex" xmlns:cx3="http://schemas.microsoft.com/office/drawing/2016/5/9/chartex" xmlns:cx4="http://schemas.microsoft.com/office/drawing/2016/5/10/chartex" xmlns:cx5="http://schemas.microsoft.com/office/drawing/2016/5/11/chartex" xmlns:cx6="http://schemas.microsoft.com/office/drawing/2016/5/12/chartex" xmlns:cx7="http://schemas.microsoft.com/office/drawing/2016/5/13/chartex" xmlns:cx8="http://schemas.microsoft.com/office/drawing/2016/5/14/chartex" xmlns:mc="http://schemas.openxmlformats.org/markup-compatibility/2006" xmlns:aink="http://schemas.microsoft.com/office/drawing/2016/ink" xmlns:am3d="http://schemas.microsoft.com/office/drawing/2017/model3d" xmlns:o="urn:schemas-microsoft-com:office:office" xmlns:oel="http://schemas.microsoft.com/office/2019/extlst" xmlns:r="http://schemas.openxmlformats.org/officeDocument/2006/relationships" xmlns:m="http://schemas.openxmlformats.org/officeDocument/2006/math" xmlns:v="urn:schemas-microsoft-com:vml" xmlns:wp14="http://schemas.microsoft.com/office/word/2010/wordprocessingDrawing" xmlns:wp="http://schemas.openxmlformats.org/drawingml/2006/wordprocessingDrawing" xmlns:w10="urn:schemas-microsoft-com:office:word" xmlns:w="http://schemas.openxmlformats.org/wordprocessingml/2006/main" xmlns:w14="http://schemas.microsoft.com/office/word/2010/wordml" xmlns:w15="http://schemas.microsoft.com/office/word/2012/wordml" xmlns:w16cex="http://schemas.microsoft.com/office/word/2018/wordml/cex" xmlns:w16cid="http://schemas.microsoft.com/office/word/2016/wordml/cid" xmlns:w16="http://schemas.microsoft.com/office/word/2018/wordml" xmlns:w16du="http://schemas.microsoft.com/office/word/2023/wordml/word16du" xmlns:w16sdtdh="http://schemas.microsoft.com/office/word/2020/wordml/sdtdatahash" xmlns:w16sdtfl="http://schemas.microsoft.com/office/word/2024/wordml/sdtformatlock" xmlns:w16se="http://schemas.microsoft.com/office/word/2015/wordml/symex" xmlns:wpg="http://schemas.microsoft.com/office/word/2010/wordprocessingGroup" xmlns:wpi="http://schemas.microsoft.com/office/word/2010/wordprocessingInk" xmlns:wne="http://schemas.microsoft.com/office/word/2006/wordml" xmlns:wps="http://schemas.microsoft.com/office/word/2010/wordprocessingShape" mc:Ignorable="w14 w15 w16se w16cid w16 w16cex w16sdtdh w16sdtfl w16du wp14">
   <w:body>
     <w:p>
       <w:pPr>
@@ -339,7 +339,7 @@
     </w:p>
     <w:tbl>
       <w:tblPr>
-        <w:tblW w:w="0" w:type="auto"/>
+        <w:tblW w:w="10059" w:type="dxa"/>
         <w:tblInd w:w="371" w:type="dxa"/>
         <w:tblBorders>
           <w:top w:val="single" w:sz="12" w:space="0" w:color="000000"/>
@@ -357,8 +357,8 @@
         <w:tblLook w:val="01E0" w:firstRow="1" w:lastRow="1" w:firstColumn="1" w:lastColumn="1" w:noHBand="0" w:noVBand="0"/>
       </w:tblPr>
       <w:tblGrid>
-        <w:gridCol w:w="295"/>
-        <w:gridCol w:w="3683"/>
+        <w:gridCol w:w="323"/>
+        <w:gridCol w:w="3655"/>
         <w:gridCol w:w="6081"/>
       </w:tblGrid>
       <w:tr>
@@ -367,7 +367,7 @@
         </w:trPr>
         <w:tc>
           <w:tcPr>
-            <w:tcW w:w="295" w:type="dxa"/>
+            <w:tcW w:w="323" w:type="dxa"/>
             <w:tcBorders>
               <w:bottom w:val="single" w:sz="6" w:space="0" w:color="000000"/>
               <w:right w:val="single" w:sz="6" w:space="0" w:color="000000"/>
@@ -402,7 +402,7 @@
         </w:tc>
         <w:tc>
           <w:tcPr>
-            <w:tcW w:w="3683" w:type="dxa"/>
+            <w:tcW w:w="3655" w:type="dxa"/>
             <w:tcBorders>
               <w:left w:val="single" w:sz="6" w:space="0" w:color="000000"/>
               <w:bottom w:val="single" w:sz="6" w:space="0" w:color="000000"/>
@@ -593,7 +593,7 @@
         </w:trPr>
         <w:tc>
           <w:tcPr>
-            <w:tcW w:w="295" w:type="dxa"/>
+            <w:tcW w:w="323" w:type="dxa"/>
             <w:tcBorders>
               <w:top w:val="single" w:sz="6" w:space="0" w:color="000000"/>
               <w:bottom w:val="single" w:sz="6" w:space="0" w:color="000000"/>
@@ -629,7 +629,7 @@
         </w:tc>
         <w:tc>
           <w:tcPr>
-            <w:tcW w:w="3683" w:type="dxa"/>
+            <w:tcW w:w="3655" w:type="dxa"/>
             <w:tcBorders>
               <w:top w:val="single" w:sz="6" w:space="0" w:color="000000"/>
               <w:left w:val="single" w:sz="6" w:space="0" w:color="000000"/>
@@ -823,7 +823,7 @@
                 <w:spacing w:val="-10"/>
                 <w:sz w:val="18"/>
               </w:rPr>
-              <w:t xml:space="preserve">        </w:t>
+              <w:t xml:space="preserve">    </w:t>
             </w:r>
             <w:r>
               <w:rPr>
@@ -880,7 +880,7 @@
         </w:trPr>
         <w:tc>
           <w:tcPr>
-            <w:tcW w:w="295" w:type="dxa"/>
+            <w:tcW w:w="323" w:type="dxa"/>
             <w:tcBorders>
               <w:top w:val="single" w:sz="6" w:space="0" w:color="000000"/>
               <w:bottom w:val="single" w:sz="6" w:space="0" w:color="000000"/>
@@ -917,7 +917,7 @@
         </w:tc>
         <w:tc>
           <w:tcPr>
-            <w:tcW w:w="3683" w:type="dxa"/>
+            <w:tcW w:w="3655" w:type="dxa"/>
             <w:tcBorders>
               <w:top w:val="single" w:sz="6" w:space="0" w:color="000000"/>
               <w:left w:val="single" w:sz="6" w:space="0" w:color="000000"/>
@@ -1149,7 +1149,7 @@
         </w:trPr>
         <w:tc>
           <w:tcPr>
-            <w:tcW w:w="295" w:type="dxa"/>
+            <w:tcW w:w="323" w:type="dxa"/>
             <w:tcBorders>
               <w:top w:val="single" w:sz="6" w:space="0" w:color="000000"/>
               <w:bottom w:val="single" w:sz="6" w:space="0" w:color="000000"/>
@@ -1185,7 +1185,7 @@
         </w:tc>
         <w:tc>
           <w:tcPr>
-            <w:tcW w:w="3683" w:type="dxa"/>
+            <w:tcW w:w="3655" w:type="dxa"/>
             <w:tcBorders>
               <w:top w:val="single" w:sz="6" w:space="0" w:color="000000"/>
               <w:left w:val="single" w:sz="6" w:space="0" w:color="000000"/>
@@ -1348,6 +1348,13 @@
             </w:r>
             <w:r>
               <w:rPr>
+                <w:spacing w:val="6"/>
+                <w:sz w:val="18"/>
+              </w:rPr>
+              <w:t xml:space="preserve">koordinasi dan konsultasi </w:t>
+            </w:r>
+            <w:r>
+              <w:rPr>
                 <w:sz w:val="18"/>
               </w:rPr>
               <w:t>kunjungan</w:t>
@@ -1431,7 +1438,7 @@
         </w:trPr>
         <w:tc>
           <w:tcPr>
-            <w:tcW w:w="295" w:type="dxa"/>
+            <w:tcW w:w="323" w:type="dxa"/>
             <w:tcBorders>
               <w:top w:val="single" w:sz="6" w:space="0" w:color="000000"/>
               <w:bottom w:val="single" w:sz="6" w:space="0" w:color="000000"/>
@@ -1467,7 +1474,7 @@
         </w:tc>
         <w:tc>
           <w:tcPr>
-            <w:tcW w:w="3683" w:type="dxa"/>
+            <w:tcW w:w="3655" w:type="dxa"/>
             <w:tcBorders>
               <w:top w:val="single" w:sz="6" w:space="0" w:color="000000"/>
               <w:left w:val="single" w:sz="6" w:space="0" w:color="000000"/>
@@ -1555,8 +1562,31 @@
               <w:rPr>
                 <w:rFonts w:ascii="Times New Roman"/>
                 <w:sz w:val="18"/>
-              </w:rPr>
-            </w:pPr>
+                <w:szCs w:val="18"/>
+              </w:rPr>
+            </w:pPr>
+          </w:p>
+          <w:p>
+            <w:pPr>
+              <w:rPr>
+                <w:sz w:val="18"/>
+                <w:szCs w:val="18"/>
+              </w:rPr>
+            </w:pPr>
+            <w:r>
+              <w:rPr>
+                <w:sz w:val="18"/>
+                <w:szCs w:val="18"/>
+              </w:rPr>
+              <w:t xml:space="preserve">    </w:t>
+            </w:r>
+            <w:r>
+              <w:rPr>
+                <w:sz w:val="18"/>
+                <w:szCs w:val="18"/>
+              </w:rPr>
+              <w:t>{{mode_transportasi}}</w:t>
+            </w:r>
           </w:p>
         </w:tc>
       </w:tr>
@@ -1566,7 +1596,7 @@
         </w:trPr>
         <w:tc>
           <w:tcPr>
-            <w:tcW w:w="295" w:type="dxa"/>
+            <w:tcW w:w="323" w:type="dxa"/>
             <w:tcBorders>
               <w:top w:val="single" w:sz="6" w:space="0" w:color="000000"/>
               <w:bottom w:val="single" w:sz="6" w:space="0" w:color="000000"/>
@@ -1602,7 +1632,7 @@
         </w:tc>
         <w:tc>
           <w:tcPr>
-            <w:tcW w:w="3683" w:type="dxa"/>
+            <w:tcW w:w="3655" w:type="dxa"/>
             <w:tcBorders>
               <w:top w:val="single" w:sz="6" w:space="0" w:color="000000"/>
               <w:left w:val="single" w:sz="6" w:space="0" w:color="000000"/>
@@ -1800,7 +1830,7 @@
         </w:trPr>
         <w:tc>
           <w:tcPr>
-            <w:tcW w:w="295" w:type="dxa"/>
+            <w:tcW w:w="323" w:type="dxa"/>
             <w:tcBorders>
               <w:top w:val="single" w:sz="6" w:space="0" w:color="000000"/>
               <w:bottom w:val="single" w:sz="6" w:space="0" w:color="000000"/>
@@ -1836,7 +1866,7 @@
         </w:tc>
         <w:tc>
           <w:tcPr>
-            <w:tcW w:w="3683" w:type="dxa"/>
+            <w:tcW w:w="3655" w:type="dxa"/>
             <w:tcBorders>
               <w:top w:val="single" w:sz="6" w:space="0" w:color="000000"/>
               <w:left w:val="single" w:sz="6" w:space="0" w:color="000000"/>
@@ -2141,7 +2171,7 @@
         </w:trPr>
         <w:tc>
           <w:tcPr>
-            <w:tcW w:w="295" w:type="dxa"/>
+            <w:tcW w:w="323" w:type="dxa"/>
             <w:tcBorders>
               <w:top w:val="single" w:sz="6" w:space="0" w:color="000000"/>
               <w:bottom w:val="single" w:sz="6" w:space="0" w:color="000000"/>
@@ -2178,7 +2208,7 @@
         </w:tc>
         <w:tc>
           <w:tcPr>
-            <w:tcW w:w="3683" w:type="dxa"/>
+            <w:tcW w:w="3655" w:type="dxa"/>
             <w:tcBorders>
               <w:top w:val="single" w:sz="6" w:space="0" w:color="000000"/>
               <w:left w:val="single" w:sz="6" w:space="0" w:color="000000"/>
@@ -2285,7 +2315,7 @@
         </w:trPr>
         <w:tc>
           <w:tcPr>
-            <w:tcW w:w="295" w:type="dxa"/>
+            <w:tcW w:w="323" w:type="dxa"/>
             <w:tcBorders>
               <w:top w:val="single" w:sz="6" w:space="0" w:color="000000"/>
               <w:bottom w:val="single" w:sz="6" w:space="0" w:color="000000"/>
@@ -2304,7 +2334,7 @@
         </w:tc>
         <w:tc>
           <w:tcPr>
-            <w:tcW w:w="3683" w:type="dxa"/>
+            <w:tcW w:w="3655" w:type="dxa"/>
             <w:tcBorders>
               <w:top w:val="single" w:sz="6" w:space="0" w:color="000000"/>
               <w:left w:val="single" w:sz="6" w:space="0" w:color="000000"/>
@@ -2441,7 +2471,7 @@
         </w:trPr>
         <w:tc>
           <w:tcPr>
-            <w:tcW w:w="295" w:type="dxa"/>
+            <w:tcW w:w="323" w:type="dxa"/>
             <w:tcBorders>
               <w:top w:val="single" w:sz="6" w:space="0" w:color="000000"/>
               <w:bottom w:val="single" w:sz="6" w:space="0" w:color="000000"/>
@@ -2477,7 +2507,7 @@
         </w:tc>
         <w:tc>
           <w:tcPr>
-            <w:tcW w:w="3683" w:type="dxa"/>
+            <w:tcW w:w="3655" w:type="dxa"/>
             <w:tcBorders>
               <w:top w:val="single" w:sz="6" w:space="0" w:color="000000"/>
               <w:left w:val="single" w:sz="6" w:space="0" w:color="000000"/>
@@ -2720,7 +2750,7 @@
         </w:trPr>
         <w:tc>
           <w:tcPr>
-            <w:tcW w:w="295" w:type="dxa"/>
+            <w:tcW w:w="323" w:type="dxa"/>
             <w:tcBorders>
               <w:top w:val="single" w:sz="6" w:space="0" w:color="000000"/>
               <w:right w:val="single" w:sz="6" w:space="0" w:color="000000"/>
@@ -2755,7 +2785,7 @@
         </w:tc>
         <w:tc>
           <w:tcPr>
-            <w:tcW w:w="3683" w:type="dxa"/>
+            <w:tcW w:w="3655" w:type="dxa"/>
             <w:tcBorders>
               <w:top w:val="single" w:sz="6" w:space="0" w:color="000000"/>
               <w:left w:val="single" w:sz="6" w:space="0" w:color="000000"/>
@@ -3124,7 +3154,7 @@
 </file>
 
 <file path=word/endnotes.xml><?xml version="1.0" encoding="utf-8"?>
-<w:endnotes xmlns:wpc="http://schemas.microsoft.com/office/word/2010/wordprocessingCanvas" xmlns:cx="http://schemas.microsoft.com/office/drawing/2014/chartex" xmlns:cx1="http://schemas.microsoft.com/office/drawing/2015/9/8/chartex" xmlns:cx2="http://schemas.microsoft.com/office/drawing/2015/10/21/chartex" xmlns:cx3="http://schemas.microsoft.com/office/drawing/2016/5/9/chartex" xmlns:cx4="http://schemas.microsoft.com/office/drawing/2016/5/10/chartex" xmlns:cx5="http://schemas.microsoft.com/office/drawing/2016/5/11/chartex" xmlns:cx6="http://schemas.microsoft.com/office/drawing/2016/5/12/chartex" xmlns:cx7="http://schemas.microsoft.com/office/drawing/2016/5/13/chartex" xmlns:cx8="http://schemas.microsoft.com/office/drawing/2016/5/14/chartex" xmlns:mc="http://schemas.openxmlformats.org/markup-compatibility/2006" xmlns:aink="http://schemas.microsoft.com/office/drawing/2016/ink" xmlns:am3d="http://schemas.microsoft.com/office/drawing/2017/model3d" xmlns:o="urn:schemas-microsoft-com:office:office" xmlns:oel="http://schemas.microsoft.com/office/2019/extlst" xmlns:r="http://schemas.openxmlformats.org/officeDocument/2006/relationships" xmlns:m="http://schemas.openxmlformats.org/officeDocument/2006/math" xmlns:v="urn:schemas-microsoft-com:vml" xmlns:wp14="http://schemas.microsoft.com/office/word/2010/wordprocessingDrawing" xmlns:wp="http://schemas.openxmlformats.org/drawingml/2006/wordprocessingDrawing" xmlns:w10="urn:schemas-microsoft-com:office:word" xmlns:w="http://schemas.openxmlformats.org/wordprocessingml/2006/main" xmlns:w14="http://schemas.microsoft.com/office/word/2010/wordml" xmlns:w15="http://schemas.microsoft.com/office/word/2012/wordml" xmlns:w16cex="http://schemas.microsoft.com/office/word/2018/wordml/cex" xmlns:w16cid="http://schemas.microsoft.com/office/word/2016/wordml/cid" xmlns:w16="http://schemas.microsoft.com/office/word/2018/wordml" xmlns:w16sdtdh="http://schemas.microsoft.com/office/word/2020/wordml/sdtdatahash" xmlns:w16se="http://schemas.microsoft.com/office/word/2015/wordml/symex" xmlns:wpg="http://schemas.microsoft.com/office/word/2010/wordprocessingGroup" xmlns:wpi="http://schemas.microsoft.com/office/word/2010/wordprocessingInk" xmlns:wne="http://schemas.microsoft.com/office/word/2006/wordml" xmlns:wps="http://schemas.microsoft.com/office/word/2010/wordprocessingShape" mc:Ignorable="w14 w15 w16se w16cid w16 w16cex w16sdtdh wp14">
+<w:endnotes xmlns:wpc="http://schemas.microsoft.com/office/word/2010/wordprocessingCanvas" xmlns:cx="http://schemas.microsoft.com/office/drawing/2014/chartex" xmlns:cx1="http://schemas.microsoft.com/office/drawing/2015/9/8/chartex" xmlns:cx2="http://schemas.microsoft.com/office/drawing/2015/10/21/chartex" xmlns:cx3="http://schemas.microsoft.com/office/drawing/2016/5/9/chartex" xmlns:cx4="http://schemas.microsoft.com/office/drawing/2016/5/10/chartex" xmlns:cx5="http://schemas.microsoft.com/office/drawing/2016/5/11/chartex" xmlns:cx6="http://schemas.microsoft.com/office/drawing/2016/5/12/chartex" xmlns:cx7="http://schemas.microsoft.com/office/drawing/2016/5/13/chartex" xmlns:cx8="http://schemas.microsoft.com/office/drawing/2016/5/14/chartex" xmlns:mc="http://schemas.openxmlformats.org/markup-compatibility/2006" xmlns:aink="http://schemas.microsoft.com/office/drawing/2016/ink" xmlns:am3d="http://schemas.microsoft.com/office/drawing/2017/model3d" xmlns:o="urn:schemas-microsoft-com:office:office" xmlns:oel="http://schemas.microsoft.com/office/2019/extlst" xmlns:r="http://schemas.openxmlformats.org/officeDocument/2006/relationships" xmlns:m="http://schemas.openxmlformats.org/officeDocument/2006/math" xmlns:v="urn:schemas-microsoft-com:vml" xmlns:wp14="http://schemas.microsoft.com/office/word/2010/wordprocessingDrawing" xmlns:wp="http://schemas.openxmlformats.org/drawingml/2006/wordprocessingDrawing" xmlns:w10="urn:schemas-microsoft-com:office:word" xmlns:w="http://schemas.openxmlformats.org/wordprocessingml/2006/main" xmlns:w14="http://schemas.microsoft.com/office/word/2010/wordml" xmlns:w15="http://schemas.microsoft.com/office/word/2012/wordml" xmlns:w16cex="http://schemas.microsoft.com/office/word/2018/wordml/cex" xmlns:w16cid="http://schemas.microsoft.com/office/word/2016/wordml/cid" xmlns:w16="http://schemas.microsoft.com/office/word/2018/wordml" xmlns:w16du="http://schemas.microsoft.com/office/word/2023/wordml/word16du" xmlns:w16sdtdh="http://schemas.microsoft.com/office/word/2020/wordml/sdtdatahash" xmlns:w16sdtfl="http://schemas.microsoft.com/office/word/2024/wordml/sdtformatlock" xmlns:w16se="http://schemas.microsoft.com/office/word/2015/wordml/symex" xmlns:wpg="http://schemas.microsoft.com/office/word/2010/wordprocessingGroup" xmlns:wpi="http://schemas.microsoft.com/office/word/2010/wordprocessingInk" xmlns:wne="http://schemas.microsoft.com/office/word/2006/wordml" xmlns:wps="http://schemas.microsoft.com/office/word/2010/wordprocessingShape" mc:Ignorable="w14 w15 w16se w16cid w16 w16cex w16sdtdh w16sdtfl w16du wp14">
   <w:endnote w:type="separator" w:id="-1">
     <w:p>
       <w:r>
@@ -3143,7 +3173,7 @@
 </file>
 
 <file path=word/footer1.xml><?xml version="1.0" encoding="utf-8"?>
-<w:ftr xmlns:wpc="http://schemas.microsoft.com/office/word/2010/wordprocessingCanvas" xmlns:cx="http://schemas.microsoft.com/office/drawing/2014/chartex" xmlns:cx1="http://schemas.microsoft.com/office/drawing/2015/9/8/chartex" xmlns:cx2="http://schemas.microsoft.com/office/drawing/2015/10/21/chartex" xmlns:cx3="http://schemas.microsoft.com/office/drawing/2016/5/9/chartex" xmlns:cx4="http://schemas.microsoft.com/office/drawing/2016/5/10/chartex" xmlns:cx5="http://schemas.microsoft.com/office/drawing/2016/5/11/chartex" xmlns:cx6="http://schemas.microsoft.com/office/drawing/2016/5/12/chartex" xmlns:cx7="http://schemas.microsoft.com/office/drawing/2016/5/13/chartex" xmlns:cx8="http://schemas.microsoft.com/office/drawing/2016/5/14/chartex" xmlns:mc="http://schemas.openxmlformats.org/markup-compatibility/2006" xmlns:aink="http://schemas.microsoft.com/office/drawing/2016/ink" xmlns:am3d="http://schemas.microsoft.com/office/drawing/2017/model3d" xmlns:o="urn:schemas-microsoft-com:office:office" xmlns:oel="http://schemas.microsoft.com/office/2019/extlst" xmlns:r="http://schemas.openxmlformats.org/officeDocument/2006/relationships" xmlns:m="http://schemas.openxmlformats.org/officeDocument/2006/math" xmlns:v="urn:schemas-microsoft-com:vml" xmlns:wp14="http://schemas.microsoft.com/office/word/2010/wordprocessingDrawing" xmlns:wp="http://schemas.openxmlformats.org/drawingml/2006/wordprocessingDrawing" xmlns:w10="urn:schemas-microsoft-com:office:word" xmlns:w="http://schemas.openxmlformats.org/wordprocessingml/2006/main" xmlns:w14="http://schemas.microsoft.com/office/word/2010/wordml" xmlns:w15="http://schemas.microsoft.com/office/word/2012/wordml" xmlns:w16cex="http://schemas.microsoft.com/office/word/2018/wordml/cex" xmlns:w16cid="http://schemas.microsoft.com/office/word/2016/wordml/cid" xmlns:w16="http://schemas.microsoft.com/office/word/2018/wordml" xmlns:w16sdtdh="http://schemas.microsoft.com/office/word/2020/wordml/sdtdatahash" xmlns:w16se="http://schemas.microsoft.com/office/word/2015/wordml/symex" xmlns:wpg="http://schemas.microsoft.com/office/word/2010/wordprocessingGroup" xmlns:wpi="http://schemas.microsoft.com/office/word/2010/wordprocessingInk" xmlns:wne="http://schemas.microsoft.com/office/word/2006/wordml" xmlns:wps="http://schemas.microsoft.com/office/word/2010/wordprocessingShape" mc:Ignorable="w14 w15 w16se w16cid w16 w16cex w16sdtdh wp14">
+<w:ftr xmlns:wpc="http://schemas.microsoft.com/office/word/2010/wordprocessingCanvas" xmlns:cx="http://schemas.microsoft.com/office/drawing/2014/chartex" xmlns:cx1="http://schemas.microsoft.com/office/drawing/2015/9/8/chartex" xmlns:cx2="http://schemas.microsoft.com/office/drawing/2015/10/21/chartex" xmlns:cx3="http://schemas.microsoft.com/office/drawing/2016/5/9/chartex" xmlns:cx4="http://schemas.microsoft.com/office/drawing/2016/5/10/chartex" xmlns:cx5="http://schemas.microsoft.com/office/drawing/2016/5/11/chartex" xmlns:cx6="http://schemas.microsoft.com/office/drawing/2016/5/12/chartex" xmlns:cx7="http://schemas.microsoft.com/office/drawing/2016/5/13/chartex" xmlns:cx8="http://schemas.microsoft.com/office/drawing/2016/5/14/chartex" xmlns:mc="http://schemas.openxmlformats.org/markup-compatibility/2006" xmlns:aink="http://schemas.microsoft.com/office/drawing/2016/ink" xmlns:am3d="http://schemas.microsoft.com/office/drawing/2017/model3d" xmlns:o="urn:schemas-microsoft-com:office:office" xmlns:oel="http://schemas.microsoft.com/office/2019/extlst" xmlns:r="http://schemas.openxmlformats.org/officeDocument/2006/relationships" xmlns:m="http://schemas.openxmlformats.org/officeDocument/2006/math" xmlns:v="urn:schemas-microsoft-com:vml" xmlns:wp14="http://schemas.microsoft.com/office/word/2010/wordprocessingDrawing" xmlns:wp="http://schemas.openxmlformats.org/drawingml/2006/wordprocessingDrawing" xmlns:w10="urn:schemas-microsoft-com:office:word" xmlns:w="http://schemas.openxmlformats.org/wordprocessingml/2006/main" xmlns:w14="http://schemas.microsoft.com/office/word/2010/wordml" xmlns:w15="http://schemas.microsoft.com/office/word/2012/wordml" xmlns:w16cex="http://schemas.microsoft.com/office/word/2018/wordml/cex" xmlns:w16cid="http://schemas.microsoft.com/office/word/2016/wordml/cid" xmlns:w16="http://schemas.microsoft.com/office/word/2018/wordml" xmlns:w16du="http://schemas.microsoft.com/office/word/2023/wordml/word16du" xmlns:w16sdtdh="http://schemas.microsoft.com/office/word/2020/wordml/sdtdatahash" xmlns:w16sdtfl="http://schemas.microsoft.com/office/word/2024/wordml/sdtformatlock" xmlns:w16se="http://schemas.microsoft.com/office/word/2015/wordml/symex" xmlns:wpg="http://schemas.microsoft.com/office/word/2010/wordprocessingGroup" xmlns:wpi="http://schemas.microsoft.com/office/word/2010/wordprocessingInk" xmlns:wne="http://schemas.microsoft.com/office/word/2006/wordml" xmlns:wps="http://schemas.microsoft.com/office/word/2010/wordprocessingShape" mc:Ignorable="w14 w15 w16se w16cid w16 w16cex w16sdtdh w16sdtfl w16du wp14">
   <w:p>
     <w:pPr>
       <w:pStyle w:val="BodyText"/>
@@ -3158,7 +3188,7 @@
 </file>
 
 <file path=word/footnotes.xml><?xml version="1.0" encoding="utf-8"?>
-<w:footnotes xmlns:wpc="http://schemas.microsoft.com/office/word/2010/wordprocessingCanvas" xmlns:cx="http://schemas.microsoft.com/office/drawing/2014/chartex" xmlns:cx1="http://schemas.microsoft.com/office/drawing/2015/9/8/chartex" xmlns:cx2="http://schemas.microsoft.com/office/drawing/2015/10/21/chartex" xmlns:cx3="http://schemas.microsoft.com/office/drawing/2016/5/9/chartex" xmlns:cx4="http://schemas.microsoft.com/office/drawing/2016/5/10/chartex" xmlns:cx5="http://schemas.microsoft.com/office/drawing/2016/5/11/chartex" xmlns:cx6="http://schemas.microsoft.com/office/drawing/2016/5/12/chartex" xmlns:cx7="http://schemas.microsoft.com/office/drawing/2016/5/13/chartex" xmlns:cx8="http://schemas.microsoft.com/office/drawing/2016/5/14/chartex" xmlns:mc="http://schemas.openxmlformats.org/markup-compatibility/2006" xmlns:aink="http://schemas.microsoft.com/office/drawing/2016/ink" xmlns:am3d="http://schemas.microsoft.com/office/drawing/2017/model3d" xmlns:o="urn:schemas-microsoft-com:office:office" xmlns:oel="http://schemas.microsoft.com/office/2019/extlst" xmlns:r="http://schemas.openxmlformats.org/officeDocument/2006/relationships" xmlns:m="http://schemas.openxmlformats.org/officeDocument/2006/math" xmlns:v="urn:schemas-microsoft-com:vml" xmlns:wp14="http://schemas.microsoft.com/office/word/2010/wordprocessingDrawing" xmlns:wp="http://schemas.openxmlformats.org/drawingml/2006/wordprocessingDrawing" xmlns:w10="urn:schemas-microsoft-com:office:word" xmlns:w="http://schemas.openxmlformats.org/wordprocessingml/2006/main" xmlns:w14="http://schemas.microsoft.com/office/word/2010/wordml" xmlns:w15="http://schemas.microsoft.com/office/word/2012/wordml" xmlns:w16cex="http://schemas.microsoft.com/office/word/2018/wordml/cex" xmlns:w16cid="http://schemas.microsoft.com/office/word/2016/wordml/cid" xmlns:w16="http://schemas.microsoft.com/office/word/2018/wordml" xmlns:w16sdtdh="http://schemas.microsoft.com/office/word/2020/wordml/sdtdatahash" xmlns:w16se="http://schemas.microsoft.com/office/word/2015/wordml/symex" xmlns:wpg="http://schemas.microsoft.com/office/word/2010/wordprocessingGroup" xmlns:wpi="http://schemas.microsoft.com/office/word/2010/wordprocessingInk" xmlns:wne="http://schemas.microsoft.com/office/word/2006/wordml" xmlns:wps="http://schemas.microsoft.com/office/word/2010/wordprocessingShape" mc:Ignorable="w14 w15 w16se w16cid w16 w16cex w16sdtdh wp14">
+<w:footnotes xmlns:wpc="http://schemas.microsoft.com/office/word/2010/wordprocessingCanvas" xmlns:cx="http://schemas.microsoft.com/office/drawing/2014/chartex" xmlns:cx1="http://schemas.microsoft.com/office/drawing/2015/9/8/chartex" xmlns:cx2="http://schemas.microsoft.com/office/drawing/2015/10/21/chartex" xmlns:cx3="http://schemas.microsoft.com/office/drawing/2016/5/9/chartex" xmlns:cx4="http://schemas.microsoft.com/office/drawing/2016/5/10/chartex" xmlns:cx5="http://schemas.microsoft.com/office/drawing/2016/5/11/chartex" xmlns:cx6="http://schemas.microsoft.com/office/drawing/2016/5/12/chartex" xmlns:cx7="http://schemas.microsoft.com/office/drawing/2016/5/13/chartex" xmlns:cx8="http://schemas.microsoft.com/office/drawing/2016/5/14/chartex" xmlns:mc="http://schemas.openxmlformats.org/markup-compatibility/2006" xmlns:aink="http://schemas.microsoft.com/office/drawing/2016/ink" xmlns:am3d="http://schemas.microsoft.com/office/drawing/2017/model3d" xmlns:o="urn:schemas-microsoft-com:office:office" xmlns:oel="http://schemas.microsoft.com/office/2019/extlst" xmlns:r="http://schemas.openxmlformats.org/officeDocument/2006/relationships" xmlns:m="http://schemas.openxmlformats.org/officeDocument/2006/math" xmlns:v="urn:schemas-microsoft-com:vml" xmlns:wp14="http://schemas.microsoft.com/office/word/2010/wordprocessingDrawing" xmlns:wp="http://schemas.openxmlformats.org/drawingml/2006/wordprocessingDrawing" xmlns:w10="urn:schemas-microsoft-com:office:word" xmlns:w="http://schemas.openxmlformats.org/wordprocessingml/2006/main" xmlns:w14="http://schemas.microsoft.com/office/word/2010/wordml" xmlns:w15="http://schemas.microsoft.com/office/word/2012/wordml" xmlns:w16cex="http://schemas.microsoft.com/office/word/2018/wordml/cex" xmlns:w16cid="http://schemas.microsoft.com/office/word/2016/wordml/cid" xmlns:w16="http://schemas.microsoft.com/office/word/2018/wordml" xmlns:w16du="http://schemas.microsoft.com/office/word/2023/wordml/word16du" xmlns:w16sdtdh="http://schemas.microsoft.com/office/word/2020/wordml/sdtdatahash" xmlns:w16sdtfl="http://schemas.microsoft.com/office/word/2024/wordml/sdtformatlock" xmlns:w16se="http://schemas.microsoft.com/office/word/2015/wordml/symex" xmlns:wpg="http://schemas.microsoft.com/office/word/2010/wordprocessingGroup" xmlns:wpi="http://schemas.microsoft.com/office/word/2010/wordprocessingInk" xmlns:wne="http://schemas.microsoft.com/office/word/2006/wordml" xmlns:wps="http://schemas.microsoft.com/office/word/2010/wordprocessingShape" mc:Ignorable="w14 w15 w16se w16cid w16 w16cex w16sdtdh w16sdtfl w16du wp14">
   <w:footnote w:type="separator" w:id="-1">
     <w:p>
       <w:r>
@@ -3177,7 +3207,7 @@
 </file>
 
 <file path=word/numbering.xml><?xml version="1.0" encoding="utf-8"?>
-<w:numbering xmlns:wpc="http://schemas.microsoft.com/office/word/2010/wordprocessingCanvas" xmlns:cx="http://schemas.microsoft.com/office/drawing/2014/chartex" xmlns:cx1="http://schemas.microsoft.com/office/drawing/2015/9/8/chartex" xmlns:cx2="http://schemas.microsoft.com/office/drawing/2015/10/21/chartex" xmlns:cx3="http://schemas.microsoft.com/office/drawing/2016/5/9/chartex" xmlns:cx4="http://schemas.microsoft.com/office/drawing/2016/5/10/chartex" xmlns:cx5="http://schemas.microsoft.com/office/drawing/2016/5/11/chartex" xmlns:cx6="http://schemas.microsoft.com/office/drawing/2016/5/12/chartex" xmlns:cx7="http://schemas.microsoft.com/office/drawing/2016/5/13/chartex" xmlns:cx8="http://schemas.microsoft.com/office/drawing/2016/5/14/chartex" xmlns:mc="http://schemas.openxmlformats.org/markup-compatibility/2006" xmlns:aink="http://schemas.microsoft.com/office/drawing/2016/ink" xmlns:am3d="http://schemas.microsoft.com/office/drawing/2017/model3d" xmlns:o="urn:schemas-microsoft-com:office:office" xmlns:oel="http://schemas.microsoft.com/office/2019/extlst" xmlns:r="http://schemas.openxmlformats.org/officeDocument/2006/relationships" xmlns:m="http://schemas.openxmlformats.org/officeDocument/2006/math" xmlns:v="urn:schemas-microsoft-com:vml" xmlns:wp14="http://schemas.microsoft.com/office/word/2010/wordprocessingDrawing" xmlns:wp="http://schemas.openxmlformats.org/drawingml/2006/wordprocessingDrawing" xmlns:w10="urn:schemas-microsoft-com:office:word" xmlns:w="http://schemas.openxmlformats.org/wordprocessingml/2006/main" xmlns:w14="http://schemas.microsoft.com/office/word/2010/wordml" xmlns:w15="http://schemas.microsoft.com/office/word/2012/wordml" xmlns:w16cex="http://schemas.microsoft.com/office/word/2018/wordml/cex" xmlns:w16cid="http://schemas.microsoft.com/office/word/2016/wordml/cid" xmlns:w16="http://schemas.microsoft.com/office/word/2018/wordml" xmlns:w16sdtdh="http://schemas.microsoft.com/office/word/2020/wordml/sdtdatahash" xmlns:w16se="http://schemas.microsoft.com/office/word/2015/wordml/symex" xmlns:wpg="http://schemas.microsoft.com/office/word/2010/wordprocessingGroup" xmlns:wpi="http://schemas.microsoft.com/office/word/2010/wordprocessingInk" xmlns:wne="http://schemas.microsoft.com/office/word/2006/wordml" xmlns:wps="http://schemas.microsoft.com/office/word/2010/wordprocessingShape" mc:Ignorable="w14 w15 w16se w16cid w16 w16cex w16sdtdh wp14">
+<w:numbering xmlns:wpc="http://schemas.microsoft.com/office/word/2010/wordprocessingCanvas" xmlns:cx="http://schemas.microsoft.com/office/drawing/2014/chartex" xmlns:cx1="http://schemas.microsoft.com/office/drawing/2015/9/8/chartex" xmlns:cx2="http://schemas.microsoft.com/office/drawing/2015/10/21/chartex" xmlns:cx3="http://schemas.microsoft.com/office/drawing/2016/5/9/chartex" xmlns:cx4="http://schemas.microsoft.com/office/drawing/2016/5/10/chartex" xmlns:cx5="http://schemas.microsoft.com/office/drawing/2016/5/11/chartex" xmlns:cx6="http://schemas.microsoft.com/office/drawing/2016/5/12/chartex" xmlns:cx7="http://schemas.microsoft.com/office/drawing/2016/5/13/chartex" xmlns:cx8="http://schemas.microsoft.com/office/drawing/2016/5/14/chartex" xmlns:mc="http://schemas.openxmlformats.org/markup-compatibility/2006" xmlns:aink="http://schemas.microsoft.com/office/drawing/2016/ink" xmlns:am3d="http://schemas.microsoft.com/office/drawing/2017/model3d" xmlns:o="urn:schemas-microsoft-com:office:office" xmlns:oel="http://schemas.microsoft.com/office/2019/extlst" xmlns:r="http://schemas.openxmlformats.org/officeDocument/2006/relationships" xmlns:m="http://schemas.openxmlformats.org/officeDocument/2006/math" xmlns:v="urn:schemas-microsoft-com:vml" xmlns:wp14="http://schemas.microsoft.com/office/word/2010/wordprocessingDrawing" xmlns:wp="http://schemas.openxmlformats.org/drawingml/2006/wordprocessingDrawing" xmlns:w10="urn:schemas-microsoft-com:office:word" xmlns:w="http://schemas.openxmlformats.org/wordprocessingml/2006/main" xmlns:w14="http://schemas.microsoft.com/office/word/2010/wordml" xmlns:w15="http://schemas.microsoft.com/office/word/2012/wordml" xmlns:w16cex="http://schemas.microsoft.com/office/word/2018/wordml/cex" xmlns:w16cid="http://schemas.microsoft.com/office/word/2016/wordml/cid" xmlns:w16="http://schemas.microsoft.com/office/word/2018/wordml" xmlns:w16du="http://schemas.microsoft.com/office/word/2023/wordml/word16du" xmlns:w16sdtdh="http://schemas.microsoft.com/office/word/2020/wordml/sdtdatahash" xmlns:w16sdtfl="http://schemas.microsoft.com/office/word/2024/wordml/sdtformatlock" xmlns:w16se="http://schemas.microsoft.com/office/word/2015/wordml/symex" xmlns:wpg="http://schemas.microsoft.com/office/word/2010/wordprocessingGroup" xmlns:wpi="http://schemas.microsoft.com/office/word/2010/wordprocessingInk" xmlns:wne="http://schemas.microsoft.com/office/word/2006/wordml" xmlns:wps="http://schemas.microsoft.com/office/word/2010/wordprocessingShape" mc:Ignorable="w14 w15 w16se w16cid w16 w16cex w16sdtdh w16sdtfl w16du wp14">
   <w:abstractNum w:abstractNumId="0" w15:restartNumberingAfterBreak="0">
     <w:nsid w:val="19EF28AB"/>
     <w:multiLevelType w:val="hybridMultilevel"/>
@@ -4024,7 +4054,7 @@
 </file>
 
 <file path=word/styles.xml><?xml version="1.0" encoding="utf-8"?>
-<w:styles xmlns:mc="http://schemas.openxmlformats.org/markup-compatibility/2006" xmlns:r="http://schemas.openxmlformats.org/officeDocument/2006/relationships" xmlns:w="http://schemas.openxmlformats.org/wordprocessingml/2006/main" xmlns:w14="http://schemas.microsoft.com/office/word/2010/wordml" xmlns:w15="http://schemas.microsoft.com/office/word/2012/wordml" xmlns:w16cex="http://schemas.microsoft.com/office/word/2018/wordml/cex" xmlns:w16cid="http://schemas.microsoft.com/office/word/2016/wordml/cid" xmlns:w16="http://schemas.microsoft.com/office/word/2018/wordml" xmlns:w16sdtdh="http://schemas.microsoft.com/office/word/2020/wordml/sdtdatahash" xmlns:w16se="http://schemas.microsoft.com/office/word/2015/wordml/symex" mc:Ignorable="w14 w15 w16se w16cid w16 w16cex w16sdtdh">
+<w:styles xmlns:mc="http://schemas.openxmlformats.org/markup-compatibility/2006" xmlns:r="http://schemas.openxmlformats.org/officeDocument/2006/relationships" xmlns:w="http://schemas.openxmlformats.org/wordprocessingml/2006/main" xmlns:w14="http://schemas.microsoft.com/office/word/2010/wordml" xmlns:w15="http://schemas.microsoft.com/office/word/2012/wordml" xmlns:w16cex="http://schemas.microsoft.com/office/word/2018/wordml/cex" xmlns:w16cid="http://schemas.microsoft.com/office/word/2016/wordml/cid" xmlns:w16="http://schemas.microsoft.com/office/word/2018/wordml" xmlns:w16du="http://schemas.microsoft.com/office/word/2023/wordml/word16du" xmlns:w16sdtdh="http://schemas.microsoft.com/office/word/2020/wordml/sdtdatahash" xmlns:w16sdtfl="http://schemas.microsoft.com/office/word/2024/wordml/sdtformatlock" xmlns:w16se="http://schemas.microsoft.com/office/word/2015/wordml/symex" mc:Ignorable="w14 w15 w16se w16cid w16 w16cex w16sdtdh w16sdtfl w16du">
   <w:docDefaults>
     <w:rPrDefault>
       <w:rPr>

</xml_diff>

<commit_message>
fix(spj): reverse sort order and update spj modal confirmation
</commit_message>
<xml_diff>
--- a/backend/templates/Berkas Luar Kota - SPD.docx
+++ b/backend/templates/Berkas Luar Kota - SPD.docx
@@ -357,8 +357,8 @@
         <w:tblLook w:val="01E0" w:firstRow="1" w:lastRow="1" w:firstColumn="1" w:lastColumn="1" w:noHBand="0" w:noVBand="0"/>
       </w:tblPr>
       <w:tblGrid>
-        <w:gridCol w:w="323"/>
-        <w:gridCol w:w="3655"/>
+        <w:gridCol w:w="465"/>
+        <w:gridCol w:w="3513"/>
         <w:gridCol w:w="6081"/>
       </w:tblGrid>
       <w:tr>
@@ -367,7 +367,7 @@
         </w:trPr>
         <w:tc>
           <w:tcPr>
-            <w:tcW w:w="323" w:type="dxa"/>
+            <w:tcW w:w="465" w:type="dxa"/>
             <w:tcBorders>
               <w:bottom w:val="single" w:sz="6" w:space="0" w:color="000000"/>
               <w:right w:val="single" w:sz="6" w:space="0" w:color="000000"/>
@@ -402,7 +402,7 @@
         </w:tc>
         <w:tc>
           <w:tcPr>
-            <w:tcW w:w="3655" w:type="dxa"/>
+            <w:tcW w:w="3513" w:type="dxa"/>
             <w:tcBorders>
               <w:left w:val="single" w:sz="6" w:space="0" w:color="000000"/>
               <w:bottom w:val="single" w:sz="6" w:space="0" w:color="000000"/>
@@ -593,7 +593,7 @@
         </w:trPr>
         <w:tc>
           <w:tcPr>
-            <w:tcW w:w="323" w:type="dxa"/>
+            <w:tcW w:w="465" w:type="dxa"/>
             <w:tcBorders>
               <w:top w:val="single" w:sz="6" w:space="0" w:color="000000"/>
               <w:bottom w:val="single" w:sz="6" w:space="0" w:color="000000"/>
@@ -629,7 +629,7 @@
         </w:tc>
         <w:tc>
           <w:tcPr>
-            <w:tcW w:w="3655" w:type="dxa"/>
+            <w:tcW w:w="3513" w:type="dxa"/>
             <w:tcBorders>
               <w:top w:val="single" w:sz="6" w:space="0" w:color="000000"/>
               <w:left w:val="single" w:sz="6" w:space="0" w:color="000000"/>
@@ -814,24 +814,6 @@
                 <w:spacing w:val="-10"/>
                 <w:sz w:val="18"/>
               </w:rPr>
-              <w:t xml:space="preserve">  </w:t>
-            </w:r>
-            <w:r>
-              <w:rPr>
-                <w:rFonts w:ascii="Arial"/>
-                <w:b/>
-                <w:spacing w:val="-10"/>
-                <w:sz w:val="18"/>
-              </w:rPr>
-              <w:t xml:space="preserve">    </w:t>
-            </w:r>
-            <w:r>
-              <w:rPr>
-                <w:rFonts w:ascii="Arial"/>
-                <w:b/>
-                <w:spacing w:val="-10"/>
-                <w:sz w:val="18"/>
-              </w:rPr>
               <w:t>/</w:t>
             </w:r>
             <w:r>
@@ -880,7 +862,7 @@
         </w:trPr>
         <w:tc>
           <w:tcPr>
-            <w:tcW w:w="323" w:type="dxa"/>
+            <w:tcW w:w="465" w:type="dxa"/>
             <w:tcBorders>
               <w:top w:val="single" w:sz="6" w:space="0" w:color="000000"/>
               <w:bottom w:val="single" w:sz="6" w:space="0" w:color="000000"/>
@@ -917,7 +899,7 @@
         </w:tc>
         <w:tc>
           <w:tcPr>
-            <w:tcW w:w="3655" w:type="dxa"/>
+            <w:tcW w:w="3513" w:type="dxa"/>
             <w:tcBorders>
               <w:top w:val="single" w:sz="6" w:space="0" w:color="000000"/>
               <w:left w:val="single" w:sz="6" w:space="0" w:color="000000"/>
@@ -1149,7 +1131,7 @@
         </w:trPr>
         <w:tc>
           <w:tcPr>
-            <w:tcW w:w="323" w:type="dxa"/>
+            <w:tcW w:w="465" w:type="dxa"/>
             <w:tcBorders>
               <w:top w:val="single" w:sz="6" w:space="0" w:color="000000"/>
               <w:bottom w:val="single" w:sz="6" w:space="0" w:color="000000"/>
@@ -1185,7 +1167,7 @@
         </w:tc>
         <w:tc>
           <w:tcPr>
-            <w:tcW w:w="3655" w:type="dxa"/>
+            <w:tcW w:w="3513" w:type="dxa"/>
             <w:tcBorders>
               <w:top w:val="single" w:sz="6" w:space="0" w:color="000000"/>
               <w:left w:val="single" w:sz="6" w:space="0" w:color="000000"/>
@@ -1438,7 +1420,7 @@
         </w:trPr>
         <w:tc>
           <w:tcPr>
-            <w:tcW w:w="323" w:type="dxa"/>
+            <w:tcW w:w="465" w:type="dxa"/>
             <w:tcBorders>
               <w:top w:val="single" w:sz="6" w:space="0" w:color="000000"/>
               <w:bottom w:val="single" w:sz="6" w:space="0" w:color="000000"/>
@@ -1474,7 +1456,7 @@
         </w:tc>
         <w:tc>
           <w:tcPr>
-            <w:tcW w:w="3655" w:type="dxa"/>
+            <w:tcW w:w="3513" w:type="dxa"/>
             <w:tcBorders>
               <w:top w:val="single" w:sz="6" w:space="0" w:color="000000"/>
               <w:left w:val="single" w:sz="6" w:space="0" w:color="000000"/>
@@ -1596,7 +1578,7 @@
         </w:trPr>
         <w:tc>
           <w:tcPr>
-            <w:tcW w:w="323" w:type="dxa"/>
+            <w:tcW w:w="465" w:type="dxa"/>
             <w:tcBorders>
               <w:top w:val="single" w:sz="6" w:space="0" w:color="000000"/>
               <w:bottom w:val="single" w:sz="6" w:space="0" w:color="000000"/>
@@ -1632,7 +1614,7 @@
         </w:tc>
         <w:tc>
           <w:tcPr>
-            <w:tcW w:w="3655" w:type="dxa"/>
+            <w:tcW w:w="3513" w:type="dxa"/>
             <w:tcBorders>
               <w:top w:val="single" w:sz="6" w:space="0" w:color="000000"/>
               <w:left w:val="single" w:sz="6" w:space="0" w:color="000000"/>
@@ -1830,7 +1812,7 @@
         </w:trPr>
         <w:tc>
           <w:tcPr>
-            <w:tcW w:w="323" w:type="dxa"/>
+            <w:tcW w:w="465" w:type="dxa"/>
             <w:tcBorders>
               <w:top w:val="single" w:sz="6" w:space="0" w:color="000000"/>
               <w:bottom w:val="single" w:sz="6" w:space="0" w:color="000000"/>
@@ -1866,7 +1848,7 @@
         </w:tc>
         <w:tc>
           <w:tcPr>
-            <w:tcW w:w="3655" w:type="dxa"/>
+            <w:tcW w:w="3513" w:type="dxa"/>
             <w:tcBorders>
               <w:top w:val="single" w:sz="6" w:space="0" w:color="000000"/>
               <w:left w:val="single" w:sz="6" w:space="0" w:color="000000"/>
@@ -2171,7 +2153,7 @@
         </w:trPr>
         <w:tc>
           <w:tcPr>
-            <w:tcW w:w="323" w:type="dxa"/>
+            <w:tcW w:w="465" w:type="dxa"/>
             <w:tcBorders>
               <w:top w:val="single" w:sz="6" w:space="0" w:color="000000"/>
               <w:bottom w:val="single" w:sz="6" w:space="0" w:color="000000"/>
@@ -2208,7 +2190,7 @@
         </w:tc>
         <w:tc>
           <w:tcPr>
-            <w:tcW w:w="3655" w:type="dxa"/>
+            <w:tcW w:w="3513" w:type="dxa"/>
             <w:tcBorders>
               <w:top w:val="single" w:sz="6" w:space="0" w:color="000000"/>
               <w:left w:val="single" w:sz="6" w:space="0" w:color="000000"/>
@@ -2315,7 +2297,7 @@
         </w:trPr>
         <w:tc>
           <w:tcPr>
-            <w:tcW w:w="323" w:type="dxa"/>
+            <w:tcW w:w="465" w:type="dxa"/>
             <w:tcBorders>
               <w:top w:val="single" w:sz="6" w:space="0" w:color="000000"/>
               <w:bottom w:val="single" w:sz="6" w:space="0" w:color="000000"/>
@@ -2334,7 +2316,7 @@
         </w:tc>
         <w:tc>
           <w:tcPr>
-            <w:tcW w:w="3655" w:type="dxa"/>
+            <w:tcW w:w="3513" w:type="dxa"/>
             <w:tcBorders>
               <w:top w:val="single" w:sz="6" w:space="0" w:color="000000"/>
               <w:left w:val="single" w:sz="6" w:space="0" w:color="000000"/>
@@ -2471,7 +2453,7 @@
         </w:trPr>
         <w:tc>
           <w:tcPr>
-            <w:tcW w:w="323" w:type="dxa"/>
+            <w:tcW w:w="465" w:type="dxa"/>
             <w:tcBorders>
               <w:top w:val="single" w:sz="6" w:space="0" w:color="000000"/>
               <w:bottom w:val="single" w:sz="6" w:space="0" w:color="000000"/>
@@ -2507,7 +2489,7 @@
         </w:tc>
         <w:tc>
           <w:tcPr>
-            <w:tcW w:w="3655" w:type="dxa"/>
+            <w:tcW w:w="3513" w:type="dxa"/>
             <w:tcBorders>
               <w:top w:val="single" w:sz="6" w:space="0" w:color="000000"/>
               <w:left w:val="single" w:sz="6" w:space="0" w:color="000000"/>
@@ -2750,7 +2732,7 @@
         </w:trPr>
         <w:tc>
           <w:tcPr>
-            <w:tcW w:w="323" w:type="dxa"/>
+            <w:tcW w:w="465" w:type="dxa"/>
             <w:tcBorders>
               <w:top w:val="single" w:sz="6" w:space="0" w:color="000000"/>
               <w:right w:val="single" w:sz="6" w:space="0" w:color="000000"/>
@@ -2785,7 +2767,7 @@
         </w:tc>
         <w:tc>
           <w:tcPr>
-            <w:tcW w:w="3655" w:type="dxa"/>
+            <w:tcW w:w="3513" w:type="dxa"/>
             <w:tcBorders>
               <w:top w:val="single" w:sz="6" w:space="0" w:color="000000"/>
               <w:left w:val="single" w:sz="6" w:space="0" w:color="000000"/>

</xml_diff>